<commit_message>
Formattazione uniforme estesa ai nove volumi storici: Barlow, giustificazione, sillabazione
Gli otto volumi rilegati ancora in Times New Roman (edizione strutturata,
opera completa, tre nuove fasi, tre continuazioni, dimensione diplomatica,
fase decima, terza strada, parabola guevariana, il vettore e il tribunale)
sono ricomposti in Barlow Semi Condensed con testo interamente giustificato
(celle di tabella comprese) e sillabazione automatica; colofoni tipografici
aggiornati; INDICE allineato. Conteggi strutturali verificati invariati.

Co-Authored-By: Claude Opus 4.8 <noreply@anthropic.com>
Claude-Session: https://claude.ai/code/session_01AhkuH2awwGPfHYRbptsHPY
</commit_message>
<xml_diff>
--- a/ALDO_MORO_UNA_GUERRA_SENZA_FINE_EDIZIONE_STRUTTURATA.docx
+++ b/ALDO_MORO_UNA_GUERRA_SENZA_FINE_EDIZIONE_STRUTTURATA.docx
@@ -9,7 +9,7 @@
       </w:pPr>
       <w:r>
         <w:rPr>
-          <w:rFonts w:ascii="Times New Roman" w:cs="Times New Roman" w:eastAsia="Times New Roman" w:hAnsi="Times New Roman"/>
+          <w:rFonts w:ascii="Barlow Semi Condensed" w:cs="Barlow Semi Condensed" w:eastAsia="Barlow Semi Condensed" w:hAnsi="Barlow Semi Condensed"/>
           <w:b/>
           <w:bCs/>
           <w:color w:val="1F3864"/>
@@ -50,7 +50,7 @@
       </w:pPr>
       <w:r>
         <w:rPr>
-          <w:rFonts w:ascii="Times New Roman" w:cs="Times New Roman" w:eastAsia="Times New Roman" w:hAnsi="Times New Roman"/>
+          <w:rFonts w:ascii="Barlow Semi Condensed" w:cs="Barlow Semi Condensed" w:eastAsia="Barlow Semi Condensed" w:hAnsi="Barlow Semi Condensed"/>
           <w:sz w:val="24"/>
           <w:szCs w:val="24"/>
         </w:rPr>
@@ -64,7 +64,7 @@
       </w:pPr>
       <w:r>
         <w:rPr>
-          <w:rFonts w:ascii="Times New Roman" w:cs="Times New Roman" w:eastAsia="Times New Roman" w:hAnsi="Times New Roman"/>
+          <w:rFonts w:ascii="Barlow Semi Condensed" w:cs="Barlow Semi Condensed" w:eastAsia="Barlow Semi Condensed" w:hAnsi="Barlow Semi Condensed"/>
           <w:sz w:val="24"/>
           <w:szCs w:val="24"/>
         </w:rPr>
@@ -78,7 +78,7 @@
       </w:pPr>
       <w:r>
         <w:rPr>
-          <w:rFonts w:ascii="Times New Roman" w:cs="Times New Roman" w:eastAsia="Times New Roman" w:hAnsi="Times New Roman"/>
+          <w:rFonts w:ascii="Barlow Semi Condensed" w:cs="Barlow Semi Condensed" w:eastAsia="Barlow Semi Condensed" w:hAnsi="Barlow Semi Condensed"/>
           <w:i/>
           <w:iCs/>
           <w:sz w:val="24"/>
@@ -94,7 +94,7 @@
       </w:pPr>
       <w:r>
         <w:rPr>
-          <w:rFonts w:ascii="Times New Roman" w:cs="Times New Roman" w:eastAsia="Times New Roman" w:hAnsi="Times New Roman"/>
+          <w:rFonts w:ascii="Barlow Semi Condensed" w:cs="Barlow Semi Condensed" w:eastAsia="Barlow Semi Condensed" w:hAnsi="Barlow Semi Condensed"/>
           <w:i/>
           <w:iCs/>
           <w:sz w:val="24"/>
@@ -114,7 +114,7 @@
       </w:pPr>
       <w:r>
         <w:rPr>
-          <w:rFonts w:ascii="Times New Roman" w:cs="Times New Roman" w:eastAsia="Times New Roman" w:hAnsi="Times New Roman"/>
+          <w:rFonts w:ascii="Barlow Semi Condensed" w:cs="Barlow Semi Condensed" w:eastAsia="Barlow Semi Condensed" w:hAnsi="Barlow Semi Condensed"/>
           <w:b/>
           <w:bCs/>
           <w:i w:val="false"/>
@@ -126,7 +126,7 @@
       </w:r>
       <w:r>
         <w:rPr>
-          <w:rFonts w:ascii="Times New Roman" w:cs="Times New Roman" w:eastAsia="Times New Roman" w:hAnsi="Times New Roman"/>
+          <w:rFonts w:ascii="Barlow Semi Condensed" w:cs="Barlow Semi Condensed" w:eastAsia="Barlow Semi Condensed" w:hAnsi="Barlow Semi Condensed"/>
           <w:i w:val="false"/>
           <w:iCs w:val="false"/>
           <w:sz w:val="24"/>
@@ -136,7 +136,7 @@
       </w:r>
       <w:r>
         <w:rPr>
-          <w:rFonts w:ascii="Times New Roman" w:cs="Times New Roman" w:eastAsia="Times New Roman" w:hAnsi="Times New Roman"/>
+          <w:rFonts w:ascii="Barlow Semi Condensed" w:cs="Barlow Semi Condensed" w:eastAsia="Barlow Semi Condensed" w:hAnsi="Barlow Semi Condensed"/>
           <w:b/>
           <w:bCs/>
           <w:i w:val="false"/>
@@ -148,7 +148,7 @@
       </w:r>
       <w:r>
         <w:rPr>
-          <w:rFonts w:ascii="Times New Roman" w:cs="Times New Roman" w:eastAsia="Times New Roman" w:hAnsi="Times New Roman"/>
+          <w:rFonts w:ascii="Barlow Semi Condensed" w:cs="Barlow Semi Condensed" w:eastAsia="Barlow Semi Condensed" w:hAnsi="Barlow Semi Condensed"/>
           <w:i w:val="false"/>
           <w:iCs w:val="false"/>
           <w:sz w:val="24"/>
@@ -158,7 +158,7 @@
       </w:r>
       <w:r>
         <w:rPr>
-          <w:rFonts w:ascii="Times New Roman" w:cs="Times New Roman" w:eastAsia="Times New Roman" w:hAnsi="Times New Roman"/>
+          <w:rFonts w:ascii="Barlow Semi Condensed" w:cs="Barlow Semi Condensed" w:eastAsia="Barlow Semi Condensed" w:hAnsi="Barlow Semi Condensed"/>
           <w:b/>
           <w:bCs/>
           <w:i w:val="false"/>
@@ -170,7 +170,7 @@
       </w:r>
       <w:r>
         <w:rPr>
-          <w:rFonts w:ascii="Times New Roman" w:cs="Times New Roman" w:eastAsia="Times New Roman" w:hAnsi="Times New Roman"/>
+          <w:rFonts w:ascii="Barlow Semi Condensed" w:cs="Barlow Semi Condensed" w:eastAsia="Barlow Semi Condensed" w:hAnsi="Barlow Semi Condensed"/>
           <w:i w:val="false"/>
           <w:iCs w:val="false"/>
           <w:sz w:val="24"/>
@@ -180,7 +180,7 @@
       </w:r>
       <w:r>
         <w:rPr>
-          <w:rFonts w:ascii="Times New Roman" w:cs="Times New Roman" w:eastAsia="Times New Roman" w:hAnsi="Times New Roman"/>
+          <w:rFonts w:ascii="Barlow Semi Condensed" w:cs="Barlow Semi Condensed" w:eastAsia="Barlow Semi Condensed" w:hAnsi="Barlow Semi Condensed"/>
           <w:b/>
           <w:bCs/>
           <w:i w:val="false"/>
@@ -192,7 +192,7 @@
       </w:r>
       <w:r>
         <w:rPr>
-          <w:rFonts w:ascii="Times New Roman" w:cs="Times New Roman" w:eastAsia="Times New Roman" w:hAnsi="Times New Roman"/>
+          <w:rFonts w:ascii="Barlow Semi Condensed" w:cs="Barlow Semi Condensed" w:eastAsia="Barlow Semi Condensed" w:hAnsi="Barlow Semi Condensed"/>
           <w:i w:val="false"/>
           <w:iCs w:val="false"/>
           <w:sz w:val="24"/>
@@ -202,7 +202,7 @@
       </w:r>
       <w:r>
         <w:rPr>
-          <w:rFonts w:ascii="Times New Roman" w:cs="Times New Roman" w:eastAsia="Times New Roman" w:hAnsi="Times New Roman"/>
+          <w:rFonts w:ascii="Barlow Semi Condensed" w:cs="Barlow Semi Condensed" w:eastAsia="Barlow Semi Condensed" w:hAnsi="Barlow Semi Condensed"/>
           <w:b/>
           <w:bCs/>
           <w:i w:val="false"/>
@@ -214,7 +214,7 @@
       </w:r>
       <w:r>
         <w:rPr>
-          <w:rFonts w:ascii="Times New Roman" w:cs="Times New Roman" w:eastAsia="Times New Roman" w:hAnsi="Times New Roman"/>
+          <w:rFonts w:ascii="Barlow Semi Condensed" w:cs="Barlow Semi Condensed" w:eastAsia="Barlow Semi Condensed" w:hAnsi="Barlow Semi Condensed"/>
           <w:i w:val="false"/>
           <w:iCs w:val="false"/>
           <w:sz w:val="24"/>
@@ -224,7 +224,7 @@
       </w:r>
       <w:r>
         <w:rPr>
-          <w:rFonts w:ascii="Times New Roman" w:cs="Times New Roman" w:eastAsia="Times New Roman" w:hAnsi="Times New Roman"/>
+          <w:rFonts w:ascii="Barlow Semi Condensed" w:cs="Barlow Semi Condensed" w:eastAsia="Barlow Semi Condensed" w:hAnsi="Barlow Semi Condensed"/>
           <w:b/>
           <w:bCs/>
           <w:i w:val="false"/>
@@ -236,7 +236,7 @@
       </w:r>
       <w:r>
         <w:rPr>
-          <w:rFonts w:ascii="Times New Roman" w:cs="Times New Roman" w:eastAsia="Times New Roman" w:hAnsi="Times New Roman"/>
+          <w:rFonts w:ascii="Barlow Semi Condensed" w:cs="Barlow Semi Condensed" w:eastAsia="Barlow Semi Condensed" w:hAnsi="Barlow Semi Condensed"/>
           <w:i w:val="false"/>
           <w:iCs w:val="false"/>
           <w:sz w:val="24"/>
@@ -260,7 +260,7 @@
       </w:pPr>
       <w:r>
         <w:rPr>
-          <w:rFonts w:ascii="Times New Roman" w:cs="Times New Roman" w:eastAsia="Times New Roman" w:hAnsi="Times New Roman"/>
+          <w:rFonts w:ascii="Barlow Semi Condensed" w:cs="Barlow Semi Condensed" w:eastAsia="Barlow Semi Condensed" w:hAnsi="Barlow Semi Condensed"/>
           <w:sz w:val="24"/>
           <w:szCs w:val="24"/>
         </w:rPr>
@@ -274,7 +274,7 @@
       </w:pPr>
       <w:r>
         <w:rPr>
-          <w:rFonts w:ascii="Times New Roman" w:cs="Times New Roman" w:eastAsia="Times New Roman" w:hAnsi="Times New Roman"/>
+          <w:rFonts w:ascii="Barlow Semi Condensed" w:cs="Barlow Semi Condensed" w:eastAsia="Barlow Semi Condensed" w:hAnsi="Barlow Semi Condensed"/>
           <w:i/>
           <w:iCs/>
           <w:sz w:val="24"/>
@@ -290,7 +290,7 @@
       </w:pPr>
       <w:r>
         <w:rPr>
-          <w:rFonts w:ascii="Times New Roman" w:cs="Times New Roman" w:eastAsia="Times New Roman" w:hAnsi="Times New Roman"/>
+          <w:rFonts w:ascii="Barlow Semi Condensed" w:cs="Barlow Semi Condensed" w:eastAsia="Barlow Semi Condensed" w:hAnsi="Barlow Semi Condensed"/>
           <w:b/>
           <w:bCs/>
           <w:sz w:val="24"/>
@@ -300,7 +300,7 @@
       </w:r>
       <w:r>
         <w:rPr>
-          <w:rFonts w:ascii="Times New Roman" w:cs="Times New Roman" w:eastAsia="Times New Roman" w:hAnsi="Times New Roman"/>
+          <w:rFonts w:ascii="Barlow Semi Condensed" w:cs="Barlow Semi Condensed" w:eastAsia="Barlow Semi Condensed" w:hAnsi="Barlow Semi Condensed"/>
           <w:sz w:val="24"/>
           <w:szCs w:val="24"/>
         </w:rPr>
@@ -308,7 +308,7 @@
       </w:r>
       <w:r>
         <w:rPr>
-          <w:rFonts w:ascii="Times New Roman" w:cs="Times New Roman" w:eastAsia="Times New Roman" w:hAnsi="Times New Roman"/>
+          <w:rFonts w:ascii="Barlow Semi Condensed" w:cs="Barlow Semi Condensed" w:eastAsia="Barlow Semi Condensed" w:hAnsi="Barlow Semi Condensed"/>
           <w:b/>
           <w:bCs/>
           <w:sz w:val="24"/>
@@ -318,7 +318,7 @@
       </w:r>
       <w:r>
         <w:rPr>
-          <w:rFonts w:ascii="Times New Roman" w:cs="Times New Roman" w:eastAsia="Times New Roman" w:hAnsi="Times New Roman"/>
+          <w:rFonts w:ascii="Barlow Semi Condensed" w:cs="Barlow Semi Condensed" w:eastAsia="Barlow Semi Condensed" w:hAnsi="Barlow Semi Condensed"/>
           <w:sz w:val="24"/>
           <w:szCs w:val="24"/>
         </w:rPr>
@@ -332,7 +332,7 @@
       </w:pPr>
       <w:r>
         <w:rPr>
-          <w:rFonts w:ascii="Times New Roman" w:cs="Times New Roman" w:eastAsia="Times New Roman" w:hAnsi="Times New Roman"/>
+          <w:rFonts w:ascii="Barlow Semi Condensed" w:cs="Barlow Semi Condensed" w:eastAsia="Barlow Semi Condensed" w:hAnsi="Barlow Semi Condensed"/>
           <w:b/>
           <w:bCs/>
           <w:sz w:val="24"/>
@@ -342,7 +342,7 @@
       </w:r>
       <w:r>
         <w:rPr>
-          <w:rFonts w:ascii="Times New Roman" w:cs="Times New Roman" w:eastAsia="Times New Roman" w:hAnsi="Times New Roman"/>
+          <w:rFonts w:ascii="Barlow Semi Condensed" w:cs="Barlow Semi Condensed" w:eastAsia="Barlow Semi Condensed" w:hAnsi="Barlow Semi Condensed"/>
           <w:sz w:val="24"/>
           <w:szCs w:val="24"/>
         </w:rPr>
@@ -350,7 +350,7 @@
       </w:r>
       <w:r>
         <w:rPr>
-          <w:rFonts w:ascii="Times New Roman" w:cs="Times New Roman" w:eastAsia="Times New Roman" w:hAnsi="Times New Roman"/>
+          <w:rFonts w:ascii="Barlow Semi Condensed" w:cs="Barlow Semi Condensed" w:eastAsia="Barlow Semi Condensed" w:hAnsi="Barlow Semi Condensed"/>
           <w:b/>
           <w:bCs/>
           <w:sz w:val="24"/>
@@ -360,7 +360,7 @@
       </w:r>
       <w:r>
         <w:rPr>
-          <w:rFonts w:ascii="Times New Roman" w:cs="Times New Roman" w:eastAsia="Times New Roman" w:hAnsi="Times New Roman"/>
+          <w:rFonts w:ascii="Barlow Semi Condensed" w:cs="Barlow Semi Condensed" w:eastAsia="Barlow Semi Condensed" w:hAnsi="Barlow Semi Condensed"/>
           <w:sz w:val="24"/>
           <w:szCs w:val="24"/>
         </w:rPr>
@@ -374,7 +374,7 @@
       </w:pPr>
       <w:r>
         <w:rPr>
-          <w:rFonts w:ascii="Times New Roman" w:cs="Times New Roman" w:eastAsia="Times New Roman" w:hAnsi="Times New Roman"/>
+          <w:rFonts w:ascii="Barlow Semi Condensed" w:cs="Barlow Semi Condensed" w:eastAsia="Barlow Semi Condensed" w:hAnsi="Barlow Semi Condensed"/>
           <w:b/>
           <w:bCs/>
           <w:sz w:val="24"/>
@@ -384,7 +384,7 @@
       </w:r>
       <w:r>
         <w:rPr>
-          <w:rFonts w:ascii="Times New Roman" w:cs="Times New Roman" w:eastAsia="Times New Roman" w:hAnsi="Times New Roman"/>
+          <w:rFonts w:ascii="Barlow Semi Condensed" w:cs="Barlow Semi Condensed" w:eastAsia="Barlow Semi Condensed" w:hAnsi="Barlow Semi Condensed"/>
           <w:sz w:val="24"/>
           <w:szCs w:val="24"/>
         </w:rPr>
@@ -392,7 +392,7 @@
       </w:r>
       <w:r>
         <w:rPr>
-          <w:rFonts w:ascii="Times New Roman" w:cs="Times New Roman" w:eastAsia="Times New Roman" w:hAnsi="Times New Roman"/>
+          <w:rFonts w:ascii="Barlow Semi Condensed" w:cs="Barlow Semi Condensed" w:eastAsia="Barlow Semi Condensed" w:hAnsi="Barlow Semi Condensed"/>
           <w:b/>
           <w:bCs/>
           <w:sz w:val="24"/>
@@ -402,7 +402,7 @@
       </w:r>
       <w:r>
         <w:rPr>
-          <w:rFonts w:ascii="Times New Roman" w:cs="Times New Roman" w:eastAsia="Times New Roman" w:hAnsi="Times New Roman"/>
+          <w:rFonts w:ascii="Barlow Semi Condensed" w:cs="Barlow Semi Condensed" w:eastAsia="Barlow Semi Condensed" w:hAnsi="Barlow Semi Condensed"/>
           <w:sz w:val="24"/>
           <w:szCs w:val="24"/>
         </w:rPr>
@@ -410,7 +410,7 @@
       </w:r>
       <w:r>
         <w:rPr>
-          <w:rFonts w:ascii="Times New Roman" w:cs="Times New Roman" w:eastAsia="Times New Roman" w:hAnsi="Times New Roman"/>
+          <w:rFonts w:ascii="Barlow Semi Condensed" w:cs="Barlow Semi Condensed" w:eastAsia="Barlow Semi Condensed" w:hAnsi="Barlow Semi Condensed"/>
           <w:b/>
           <w:bCs/>
           <w:sz w:val="24"/>
@@ -420,7 +420,7 @@
       </w:r>
       <w:r>
         <w:rPr>
-          <w:rFonts w:ascii="Times New Roman" w:cs="Times New Roman" w:eastAsia="Times New Roman" w:hAnsi="Times New Roman"/>
+          <w:rFonts w:ascii="Barlow Semi Condensed" w:cs="Barlow Semi Condensed" w:eastAsia="Barlow Semi Condensed" w:hAnsi="Barlow Semi Condensed"/>
           <w:sz w:val="24"/>
           <w:szCs w:val="24"/>
         </w:rPr>
@@ -428,7 +428,7 @@
       </w:r>
       <w:r>
         <w:rPr>
-          <w:rFonts w:ascii="Times New Roman" w:cs="Times New Roman" w:eastAsia="Times New Roman" w:hAnsi="Times New Roman"/>
+          <w:rFonts w:ascii="Barlow Semi Condensed" w:cs="Barlow Semi Condensed" w:eastAsia="Barlow Semi Condensed" w:hAnsi="Barlow Semi Condensed"/>
           <w:b/>
           <w:bCs/>
           <w:sz w:val="24"/>
@@ -438,7 +438,7 @@
       </w:r>
       <w:r>
         <w:rPr>
-          <w:rFonts w:ascii="Times New Roman" w:cs="Times New Roman" w:eastAsia="Times New Roman" w:hAnsi="Times New Roman"/>
+          <w:rFonts w:ascii="Barlow Semi Condensed" w:cs="Barlow Semi Condensed" w:eastAsia="Barlow Semi Condensed" w:hAnsi="Barlow Semi Condensed"/>
           <w:sz w:val="24"/>
           <w:szCs w:val="24"/>
         </w:rPr>
@@ -446,7 +446,7 @@
       </w:r>
       <w:r>
         <w:rPr>
-          <w:rFonts w:ascii="Times New Roman" w:cs="Times New Roman" w:eastAsia="Times New Roman" w:hAnsi="Times New Roman"/>
+          <w:rFonts w:ascii="Barlow Semi Condensed" w:cs="Barlow Semi Condensed" w:eastAsia="Barlow Semi Condensed" w:hAnsi="Barlow Semi Condensed"/>
           <w:b/>
           <w:bCs/>
           <w:sz w:val="24"/>
@@ -456,7 +456,7 @@
       </w:r>
       <w:r>
         <w:rPr>
-          <w:rFonts w:ascii="Times New Roman" w:cs="Times New Roman" w:eastAsia="Times New Roman" w:hAnsi="Times New Roman"/>
+          <w:rFonts w:ascii="Barlow Semi Condensed" w:cs="Barlow Semi Condensed" w:eastAsia="Barlow Semi Condensed" w:hAnsi="Barlow Semi Condensed"/>
           <w:sz w:val="24"/>
           <w:szCs w:val="24"/>
         </w:rPr>
@@ -464,7 +464,7 @@
       </w:r>
       <w:r>
         <w:rPr>
-          <w:rFonts w:ascii="Times New Roman" w:cs="Times New Roman" w:eastAsia="Times New Roman" w:hAnsi="Times New Roman"/>
+          <w:rFonts w:ascii="Barlow Semi Condensed" w:cs="Barlow Semi Condensed" w:eastAsia="Barlow Semi Condensed" w:hAnsi="Barlow Semi Condensed"/>
           <w:b/>
           <w:bCs/>
           <w:sz w:val="24"/>
@@ -474,7 +474,7 @@
       </w:r>
       <w:r>
         <w:rPr>
-          <w:rFonts w:ascii="Times New Roman" w:cs="Times New Roman" w:eastAsia="Times New Roman" w:hAnsi="Times New Roman"/>
+          <w:rFonts w:ascii="Barlow Semi Condensed" w:cs="Barlow Semi Condensed" w:eastAsia="Barlow Semi Condensed" w:hAnsi="Barlow Semi Condensed"/>
           <w:sz w:val="24"/>
           <w:szCs w:val="24"/>
         </w:rPr>
@@ -488,7 +488,7 @@
       </w:pPr>
       <w:r>
         <w:rPr>
-          <w:rFonts w:ascii="Times New Roman" w:cs="Times New Roman" w:eastAsia="Times New Roman" w:hAnsi="Times New Roman"/>
+          <w:rFonts w:ascii="Barlow Semi Condensed" w:cs="Barlow Semi Condensed" w:eastAsia="Barlow Semi Condensed" w:hAnsi="Barlow Semi Condensed"/>
           <w:b/>
           <w:bCs/>
           <w:sz w:val="24"/>
@@ -498,7 +498,7 @@
       </w:r>
       <w:r>
         <w:rPr>
-          <w:rFonts w:ascii="Times New Roman" w:cs="Times New Roman" w:eastAsia="Times New Roman" w:hAnsi="Times New Roman"/>
+          <w:rFonts w:ascii="Barlow Semi Condensed" w:cs="Barlow Semi Condensed" w:eastAsia="Barlow Semi Condensed" w:hAnsi="Barlow Semi Condensed"/>
           <w:sz w:val="24"/>
           <w:szCs w:val="24"/>
         </w:rPr>
@@ -512,7 +512,7 @@
       </w:pPr>
       <w:r>
         <w:rPr>
-          <w:rFonts w:ascii="Times New Roman" w:cs="Times New Roman" w:eastAsia="Times New Roman" w:hAnsi="Times New Roman"/>
+          <w:rFonts w:ascii="Barlow Semi Condensed" w:cs="Barlow Semi Condensed" w:eastAsia="Barlow Semi Condensed" w:hAnsi="Barlow Semi Condensed"/>
           <w:sz w:val="24"/>
           <w:szCs w:val="24"/>
         </w:rPr>
@@ -526,7 +526,7 @@
       </w:pPr>
       <w:r>
         <w:rPr>
-          <w:rFonts w:ascii="Times New Roman" w:cs="Times New Roman" w:eastAsia="Times New Roman" w:hAnsi="Times New Roman"/>
+          <w:rFonts w:ascii="Barlow Semi Condensed" w:cs="Barlow Semi Condensed" w:eastAsia="Barlow Semi Condensed" w:hAnsi="Barlow Semi Condensed"/>
           <w:sz w:val="24"/>
           <w:szCs w:val="24"/>
         </w:rPr>
@@ -534,7 +534,7 @@
       </w:r>
       <w:r>
         <w:rPr>
-          <w:rFonts w:ascii="Times New Roman" w:cs="Times New Roman" w:eastAsia="Times New Roman" w:hAnsi="Times New Roman"/>
+          <w:rFonts w:ascii="Barlow Semi Condensed" w:cs="Barlow Semi Condensed" w:eastAsia="Barlow Semi Condensed" w:hAnsi="Barlow Semi Condensed"/>
           <w:i/>
           <w:iCs/>
           <w:sz w:val="24"/>
@@ -550,7 +550,7 @@
       </w:pPr>
       <w:r>
         <w:rPr>
-          <w:rFonts w:ascii="Times New Roman" w:cs="Times New Roman" w:eastAsia="Times New Roman" w:hAnsi="Times New Roman"/>
+          <w:rFonts w:ascii="Barlow Semi Condensed" w:cs="Barlow Semi Condensed" w:eastAsia="Barlow Semi Condensed" w:hAnsi="Barlow Semi Condensed"/>
           <w:sz w:val="24"/>
           <w:szCs w:val="24"/>
         </w:rPr>
@@ -564,7 +564,7 @@
       </w:pPr>
       <w:r>
         <w:rPr>
-          <w:rFonts w:ascii="Times New Roman" w:cs="Times New Roman" w:eastAsia="Times New Roman" w:hAnsi="Times New Roman"/>
+          <w:rFonts w:ascii="Barlow Semi Condensed" w:cs="Barlow Semi Condensed" w:eastAsia="Barlow Semi Condensed" w:hAnsi="Barlow Semi Condensed"/>
           <w:sz w:val="24"/>
           <w:szCs w:val="24"/>
         </w:rPr>
@@ -572,7 +572,7 @@
       </w:r>
       <w:r>
         <w:rPr>
-          <w:rFonts w:ascii="Times New Roman" w:cs="Times New Roman" w:eastAsia="Times New Roman" w:hAnsi="Times New Roman"/>
+          <w:rFonts w:ascii="Barlow Semi Condensed" w:cs="Barlow Semi Condensed" w:eastAsia="Barlow Semi Condensed" w:hAnsi="Barlow Semi Condensed"/>
           <w:i/>
           <w:iCs/>
           <w:sz w:val="24"/>
@@ -588,7 +588,7 @@
       </w:pPr>
       <w:r>
         <w:rPr>
-          <w:rFonts w:ascii="Times New Roman" w:cs="Times New Roman" w:eastAsia="Times New Roman" w:hAnsi="Times New Roman"/>
+          <w:rFonts w:ascii="Barlow Semi Condensed" w:cs="Barlow Semi Condensed" w:eastAsia="Barlow Semi Condensed" w:hAnsi="Barlow Semi Condensed"/>
           <w:sz w:val="24"/>
           <w:szCs w:val="24"/>
         </w:rPr>
@@ -602,7 +602,7 @@
       </w:pPr>
       <w:r>
         <w:rPr>
-          <w:rFonts w:ascii="Times New Roman" w:cs="Times New Roman" w:eastAsia="Times New Roman" w:hAnsi="Times New Roman"/>
+          <w:rFonts w:ascii="Barlow Semi Condensed" w:cs="Barlow Semi Condensed" w:eastAsia="Barlow Semi Condensed" w:hAnsi="Barlow Semi Condensed"/>
           <w:sz w:val="24"/>
           <w:szCs w:val="24"/>
         </w:rPr>
@@ -610,7 +610,7 @@
       </w:r>
       <w:r>
         <w:rPr>
-          <w:rFonts w:ascii="Times New Roman" w:cs="Times New Roman" w:eastAsia="Times New Roman" w:hAnsi="Times New Roman"/>
+          <w:rFonts w:ascii="Barlow Semi Condensed" w:cs="Barlow Semi Condensed" w:eastAsia="Barlow Semi Condensed" w:hAnsi="Barlow Semi Condensed"/>
           <w:b/>
           <w:bCs/>
           <w:sz w:val="24"/>
@@ -620,7 +620,7 @@
       </w:r>
       <w:r>
         <w:rPr>
-          <w:rFonts w:ascii="Times New Roman" w:cs="Times New Roman" w:eastAsia="Times New Roman" w:hAnsi="Times New Roman"/>
+          <w:rFonts w:ascii="Barlow Semi Condensed" w:cs="Barlow Semi Condensed" w:eastAsia="Barlow Semi Condensed" w:hAnsi="Barlow Semi Condensed"/>
           <w:sz w:val="24"/>
           <w:szCs w:val="24"/>
         </w:rPr>
@@ -628,7 +628,7 @@
       </w:r>
       <w:r>
         <w:rPr>
-          <w:rFonts w:ascii="Times New Roman" w:cs="Times New Roman" w:eastAsia="Times New Roman" w:hAnsi="Times New Roman"/>
+          <w:rFonts w:ascii="Barlow Semi Condensed" w:cs="Barlow Semi Condensed" w:eastAsia="Barlow Semi Condensed" w:hAnsi="Barlow Semi Condensed"/>
           <w:b/>
           <w:bCs/>
           <w:sz w:val="24"/>
@@ -638,7 +638,7 @@
       </w:r>
       <w:r>
         <w:rPr>
-          <w:rFonts w:ascii="Times New Roman" w:cs="Times New Roman" w:eastAsia="Times New Roman" w:hAnsi="Times New Roman"/>
+          <w:rFonts w:ascii="Barlow Semi Condensed" w:cs="Barlow Semi Condensed" w:eastAsia="Barlow Semi Condensed" w:hAnsi="Barlow Semi Condensed"/>
           <w:sz w:val="24"/>
           <w:szCs w:val="24"/>
         </w:rPr>
@@ -646,7 +646,7 @@
       </w:r>
       <w:r>
         <w:rPr>
-          <w:rFonts w:ascii="Times New Roman" w:cs="Times New Roman" w:eastAsia="Times New Roman" w:hAnsi="Times New Roman"/>
+          <w:rFonts w:ascii="Barlow Semi Condensed" w:cs="Barlow Semi Condensed" w:eastAsia="Barlow Semi Condensed" w:hAnsi="Barlow Semi Condensed"/>
           <w:b/>
           <w:bCs/>
           <w:sz w:val="24"/>
@@ -656,7 +656,7 @@
       </w:r>
       <w:r>
         <w:rPr>
-          <w:rFonts w:ascii="Times New Roman" w:cs="Times New Roman" w:eastAsia="Times New Roman" w:hAnsi="Times New Roman"/>
+          <w:rFonts w:ascii="Barlow Semi Condensed" w:cs="Barlow Semi Condensed" w:eastAsia="Barlow Semi Condensed" w:hAnsi="Barlow Semi Condensed"/>
           <w:sz w:val="24"/>
           <w:szCs w:val="24"/>
         </w:rPr>
@@ -664,7 +664,7 @@
       </w:r>
       <w:r>
         <w:rPr>
-          <w:rFonts w:ascii="Times New Roman" w:cs="Times New Roman" w:eastAsia="Times New Roman" w:hAnsi="Times New Roman"/>
+          <w:rFonts w:ascii="Barlow Semi Condensed" w:cs="Barlow Semi Condensed" w:eastAsia="Barlow Semi Condensed" w:hAnsi="Barlow Semi Condensed"/>
           <w:b/>
           <w:bCs/>
           <w:sz w:val="24"/>
@@ -674,7 +674,7 @@
       </w:r>
       <w:r>
         <w:rPr>
-          <w:rFonts w:ascii="Times New Roman" w:cs="Times New Roman" w:eastAsia="Times New Roman" w:hAnsi="Times New Roman"/>
+          <w:rFonts w:ascii="Barlow Semi Condensed" w:cs="Barlow Semi Condensed" w:eastAsia="Barlow Semi Condensed" w:hAnsi="Barlow Semi Condensed"/>
           <w:sz w:val="24"/>
           <w:szCs w:val="24"/>
         </w:rPr>
@@ -682,7 +682,7 @@
       </w:r>
       <w:r>
         <w:rPr>
-          <w:rFonts w:ascii="Times New Roman" w:cs="Times New Roman" w:eastAsia="Times New Roman" w:hAnsi="Times New Roman"/>
+          <w:rFonts w:ascii="Barlow Semi Condensed" w:cs="Barlow Semi Condensed" w:eastAsia="Barlow Semi Condensed" w:hAnsi="Barlow Semi Condensed"/>
           <w:b/>
           <w:bCs/>
           <w:sz w:val="24"/>
@@ -692,7 +692,7 @@
       </w:r>
       <w:r>
         <w:rPr>
-          <w:rFonts w:ascii="Times New Roman" w:cs="Times New Roman" w:eastAsia="Times New Roman" w:hAnsi="Times New Roman"/>
+          <w:rFonts w:ascii="Barlow Semi Condensed" w:cs="Barlow Semi Condensed" w:eastAsia="Barlow Semi Condensed" w:hAnsi="Barlow Semi Condensed"/>
           <w:sz w:val="24"/>
           <w:szCs w:val="24"/>
         </w:rPr>
@@ -700,7 +700,7 @@
       </w:r>
       <w:r>
         <w:rPr>
-          <w:rFonts w:ascii="Times New Roman" w:cs="Times New Roman" w:eastAsia="Times New Roman" w:hAnsi="Times New Roman"/>
+          <w:rFonts w:ascii="Barlow Semi Condensed" w:cs="Barlow Semi Condensed" w:eastAsia="Barlow Semi Condensed" w:hAnsi="Barlow Semi Condensed"/>
           <w:b/>
           <w:bCs/>
           <w:sz w:val="24"/>
@@ -710,7 +710,7 @@
       </w:r>
       <w:r>
         <w:rPr>
-          <w:rFonts w:ascii="Times New Roman" w:cs="Times New Roman" w:eastAsia="Times New Roman" w:hAnsi="Times New Roman"/>
+          <w:rFonts w:ascii="Barlow Semi Condensed" w:cs="Barlow Semi Condensed" w:eastAsia="Barlow Semi Condensed" w:hAnsi="Barlow Semi Condensed"/>
           <w:sz w:val="24"/>
           <w:szCs w:val="24"/>
         </w:rPr>
@@ -718,7 +718,7 @@
       </w:r>
       <w:r>
         <w:rPr>
-          <w:rFonts w:ascii="Times New Roman" w:cs="Times New Roman" w:eastAsia="Times New Roman" w:hAnsi="Times New Roman"/>
+          <w:rFonts w:ascii="Barlow Semi Condensed" w:cs="Barlow Semi Condensed" w:eastAsia="Barlow Semi Condensed" w:hAnsi="Barlow Semi Condensed"/>
           <w:i/>
           <w:iCs/>
           <w:sz w:val="24"/>
@@ -734,7 +734,7 @@
       </w:pPr>
       <w:r>
         <w:rPr>
-          <w:rFonts w:ascii="Times New Roman" w:cs="Times New Roman" w:eastAsia="Times New Roman" w:hAnsi="Times New Roman"/>
+          <w:rFonts w:ascii="Barlow Semi Condensed" w:cs="Barlow Semi Condensed" w:eastAsia="Barlow Semi Condensed" w:hAnsi="Barlow Semi Condensed"/>
           <w:sz w:val="24"/>
           <w:szCs w:val="24"/>
         </w:rPr>
@@ -748,7 +748,7 @@
       </w:pPr>
       <w:r>
         <w:rPr>
-          <w:rFonts w:ascii="Times New Roman" w:cs="Times New Roman" w:eastAsia="Times New Roman" w:hAnsi="Times New Roman"/>
+          <w:rFonts w:ascii="Barlow Semi Condensed" w:cs="Barlow Semi Condensed" w:eastAsia="Barlow Semi Condensed" w:hAnsi="Barlow Semi Condensed"/>
           <w:sz w:val="24"/>
           <w:szCs w:val="24"/>
         </w:rPr>
@@ -756,7 +756,7 @@
       </w:r>
       <w:r>
         <w:rPr>
-          <w:rFonts w:ascii="Times New Roman" w:cs="Times New Roman" w:eastAsia="Times New Roman" w:hAnsi="Times New Roman"/>
+          <w:rFonts w:ascii="Barlow Semi Condensed" w:cs="Barlow Semi Condensed" w:eastAsia="Barlow Semi Condensed" w:hAnsi="Barlow Semi Condensed"/>
           <w:i/>
           <w:iCs/>
           <w:sz w:val="24"/>
@@ -772,7 +772,7 @@
       </w:pPr>
       <w:r>
         <w:rPr>
-          <w:rFonts w:ascii="Times New Roman" w:cs="Times New Roman" w:eastAsia="Times New Roman" w:hAnsi="Times New Roman"/>
+          <w:rFonts w:ascii="Barlow Semi Condensed" w:cs="Barlow Semi Condensed" w:eastAsia="Barlow Semi Condensed" w:hAnsi="Barlow Semi Condensed"/>
           <w:sz w:val="24"/>
           <w:szCs w:val="24"/>
         </w:rPr>
@@ -786,7 +786,7 @@
       </w:pPr>
       <w:r>
         <w:rPr>
-          <w:rFonts w:ascii="Times New Roman" w:cs="Times New Roman" w:eastAsia="Times New Roman" w:hAnsi="Times New Roman"/>
+          <w:rFonts w:ascii="Barlow Semi Condensed" w:cs="Barlow Semi Condensed" w:eastAsia="Barlow Semi Condensed" w:hAnsi="Barlow Semi Condensed"/>
           <w:sz w:val="24"/>
           <w:szCs w:val="24"/>
         </w:rPr>
@@ -794,7 +794,7 @@
       </w:r>
       <w:r>
         <w:rPr>
-          <w:rFonts w:ascii="Times New Roman" w:cs="Times New Roman" w:eastAsia="Times New Roman" w:hAnsi="Times New Roman"/>
+          <w:rFonts w:ascii="Barlow Semi Condensed" w:cs="Barlow Semi Condensed" w:eastAsia="Barlow Semi Condensed" w:hAnsi="Barlow Semi Condensed"/>
           <w:i/>
           <w:iCs/>
           <w:sz w:val="24"/>
@@ -810,7 +810,7 @@
       </w:pPr>
       <w:r>
         <w:rPr>
-          <w:rFonts w:ascii="Times New Roman" w:cs="Times New Roman" w:eastAsia="Times New Roman" w:hAnsi="Times New Roman"/>
+          <w:rFonts w:ascii="Barlow Semi Condensed" w:cs="Barlow Semi Condensed" w:eastAsia="Barlow Semi Condensed" w:hAnsi="Barlow Semi Condensed"/>
           <w:sz w:val="24"/>
           <w:szCs w:val="24"/>
         </w:rPr>
@@ -824,7 +824,7 @@
       </w:pPr>
       <w:r>
         <w:rPr>
-          <w:rFonts w:ascii="Times New Roman" w:cs="Times New Roman" w:eastAsia="Times New Roman" w:hAnsi="Times New Roman"/>
+          <w:rFonts w:ascii="Barlow Semi Condensed" w:cs="Barlow Semi Condensed" w:eastAsia="Barlow Semi Condensed" w:hAnsi="Barlow Semi Condensed"/>
           <w:sz w:val="24"/>
           <w:szCs w:val="24"/>
         </w:rPr>
@@ -832,7 +832,7 @@
       </w:r>
       <w:r>
         <w:rPr>
-          <w:rFonts w:ascii="Times New Roman" w:cs="Times New Roman" w:eastAsia="Times New Roman" w:hAnsi="Times New Roman"/>
+          <w:rFonts w:ascii="Barlow Semi Condensed" w:cs="Barlow Semi Condensed" w:eastAsia="Barlow Semi Condensed" w:hAnsi="Barlow Semi Condensed"/>
           <w:i/>
           <w:iCs/>
           <w:sz w:val="24"/>
@@ -848,7 +848,7 @@
       </w:pPr>
       <w:r>
         <w:rPr>
-          <w:rFonts w:ascii="Times New Roman" w:cs="Times New Roman" w:eastAsia="Times New Roman" w:hAnsi="Times New Roman"/>
+          <w:rFonts w:ascii="Barlow Semi Condensed" w:cs="Barlow Semi Condensed" w:eastAsia="Barlow Semi Condensed" w:hAnsi="Barlow Semi Condensed"/>
           <w:sz w:val="24"/>
           <w:szCs w:val="24"/>
         </w:rPr>
@@ -862,7 +862,7 @@
       </w:pPr>
       <w:r>
         <w:rPr>
-          <w:rFonts w:ascii="Times New Roman" w:cs="Times New Roman" w:eastAsia="Times New Roman" w:hAnsi="Times New Roman"/>
+          <w:rFonts w:ascii="Barlow Semi Condensed" w:cs="Barlow Semi Condensed" w:eastAsia="Barlow Semi Condensed" w:hAnsi="Barlow Semi Condensed"/>
           <w:sz w:val="24"/>
           <w:szCs w:val="24"/>
         </w:rPr>
@@ -870,7 +870,7 @@
       </w:r>
       <w:r>
         <w:rPr>
-          <w:rFonts w:ascii="Times New Roman" w:cs="Times New Roman" w:eastAsia="Times New Roman" w:hAnsi="Times New Roman"/>
+          <w:rFonts w:ascii="Barlow Semi Condensed" w:cs="Barlow Semi Condensed" w:eastAsia="Barlow Semi Condensed" w:hAnsi="Barlow Semi Condensed"/>
           <w:b/>
           <w:bCs/>
           <w:sz w:val="24"/>
@@ -880,7 +880,7 @@
       </w:r>
       <w:r>
         <w:rPr>
-          <w:rFonts w:ascii="Times New Roman" w:cs="Times New Roman" w:eastAsia="Times New Roman" w:hAnsi="Times New Roman"/>
+          <w:rFonts w:ascii="Barlow Semi Condensed" w:cs="Barlow Semi Condensed" w:eastAsia="Barlow Semi Condensed" w:hAnsi="Barlow Semi Condensed"/>
           <w:sz w:val="24"/>
           <w:szCs w:val="24"/>
         </w:rPr>
@@ -888,7 +888,7 @@
       </w:r>
       <w:r>
         <w:rPr>
-          <w:rFonts w:ascii="Times New Roman" w:cs="Times New Roman" w:eastAsia="Times New Roman" w:hAnsi="Times New Roman"/>
+          <w:rFonts w:ascii="Barlow Semi Condensed" w:cs="Barlow Semi Condensed" w:eastAsia="Barlow Semi Condensed" w:hAnsi="Barlow Semi Condensed"/>
           <w:i/>
           <w:iCs/>
           <w:sz w:val="24"/>
@@ -904,7 +904,7 @@
       </w:pPr>
       <w:r>
         <w:rPr>
-          <w:rFonts w:ascii="Times New Roman" w:cs="Times New Roman" w:eastAsia="Times New Roman" w:hAnsi="Times New Roman"/>
+          <w:rFonts w:ascii="Barlow Semi Condensed" w:cs="Barlow Semi Condensed" w:eastAsia="Barlow Semi Condensed" w:hAnsi="Barlow Semi Condensed"/>
           <w:sz w:val="24"/>
           <w:szCs w:val="24"/>
         </w:rPr>
@@ -918,7 +918,7 @@
       </w:pPr>
       <w:r>
         <w:rPr>
-          <w:rFonts w:ascii="Times New Roman" w:cs="Times New Roman" w:eastAsia="Times New Roman" w:hAnsi="Times New Roman"/>
+          <w:rFonts w:ascii="Barlow Semi Condensed" w:cs="Barlow Semi Condensed" w:eastAsia="Barlow Semi Condensed" w:hAnsi="Barlow Semi Condensed"/>
           <w:sz w:val="24"/>
           <w:szCs w:val="24"/>
         </w:rPr>
@@ -926,7 +926,7 @@
       </w:r>
       <w:r>
         <w:rPr>
-          <w:rFonts w:ascii="Times New Roman" w:cs="Times New Roman" w:eastAsia="Times New Roman" w:hAnsi="Times New Roman"/>
+          <w:rFonts w:ascii="Barlow Semi Condensed" w:cs="Barlow Semi Condensed" w:eastAsia="Barlow Semi Condensed" w:hAnsi="Barlow Semi Condensed"/>
           <w:i/>
           <w:iCs/>
           <w:sz w:val="24"/>
@@ -942,7 +942,7 @@
       </w:pPr>
       <w:r>
         <w:rPr>
-          <w:rFonts w:ascii="Times New Roman" w:cs="Times New Roman" w:eastAsia="Times New Roman" w:hAnsi="Times New Roman"/>
+          <w:rFonts w:ascii="Barlow Semi Condensed" w:cs="Barlow Semi Condensed" w:eastAsia="Barlow Semi Condensed" w:hAnsi="Barlow Semi Condensed"/>
           <w:b/>
           <w:bCs/>
           <w:sz w:val="24"/>
@@ -952,7 +952,7 @@
       </w:r>
       <w:r>
         <w:rPr>
-          <w:rFonts w:ascii="Times New Roman" w:cs="Times New Roman" w:eastAsia="Times New Roman" w:hAnsi="Times New Roman"/>
+          <w:rFonts w:ascii="Barlow Semi Condensed" w:cs="Barlow Semi Condensed" w:eastAsia="Barlow Semi Condensed" w:hAnsi="Barlow Semi Condensed"/>
           <w:sz w:val="24"/>
           <w:szCs w:val="24"/>
         </w:rPr>
@@ -966,7 +966,7 @@
       </w:pPr>
       <w:r>
         <w:rPr>
-          <w:rFonts w:ascii="Times New Roman" w:cs="Times New Roman" w:eastAsia="Times New Roman" w:hAnsi="Times New Roman"/>
+          <w:rFonts w:ascii="Barlow Semi Condensed" w:cs="Barlow Semi Condensed" w:eastAsia="Barlow Semi Condensed" w:hAnsi="Barlow Semi Condensed"/>
           <w:b/>
           <w:bCs/>
           <w:sz w:val="24"/>
@@ -976,7 +976,7 @@
       </w:r>
       <w:r>
         <w:rPr>
-          <w:rFonts w:ascii="Times New Roman" w:cs="Times New Roman" w:eastAsia="Times New Roman" w:hAnsi="Times New Roman"/>
+          <w:rFonts w:ascii="Barlow Semi Condensed" w:cs="Barlow Semi Condensed" w:eastAsia="Barlow Semi Condensed" w:hAnsi="Barlow Semi Condensed"/>
           <w:sz w:val="24"/>
           <w:szCs w:val="24"/>
         </w:rPr>
@@ -990,7 +990,7 @@
       </w:pPr>
       <w:r>
         <w:rPr>
-          <w:rFonts w:ascii="Times New Roman" w:cs="Times New Roman" w:eastAsia="Times New Roman" w:hAnsi="Times New Roman"/>
+          <w:rFonts w:ascii="Barlow Semi Condensed" w:cs="Barlow Semi Condensed" w:eastAsia="Barlow Semi Condensed" w:hAnsi="Barlow Semi Condensed"/>
           <w:b/>
           <w:bCs/>
           <w:sz w:val="24"/>
@@ -1000,7 +1000,7 @@
       </w:r>
       <w:r>
         <w:rPr>
-          <w:rFonts w:ascii="Times New Roman" w:cs="Times New Roman" w:eastAsia="Times New Roman" w:hAnsi="Times New Roman"/>
+          <w:rFonts w:ascii="Barlow Semi Condensed" w:cs="Barlow Semi Condensed" w:eastAsia="Barlow Semi Condensed" w:hAnsi="Barlow Semi Condensed"/>
           <w:sz w:val="24"/>
           <w:szCs w:val="24"/>
         </w:rPr>
@@ -1014,7 +1014,7 @@
       </w:pPr>
       <w:r>
         <w:rPr>
-          <w:rFonts w:ascii="Times New Roman" w:cs="Times New Roman" w:eastAsia="Times New Roman" w:hAnsi="Times New Roman"/>
+          <w:rFonts w:ascii="Barlow Semi Condensed" w:cs="Barlow Semi Condensed" w:eastAsia="Barlow Semi Condensed" w:hAnsi="Barlow Semi Condensed"/>
           <w:b/>
           <w:bCs/>
           <w:sz w:val="24"/>
@@ -1024,7 +1024,7 @@
       </w:r>
       <w:r>
         <w:rPr>
-          <w:rFonts w:ascii="Times New Roman" w:cs="Times New Roman" w:eastAsia="Times New Roman" w:hAnsi="Times New Roman"/>
+          <w:rFonts w:ascii="Barlow Semi Condensed" w:cs="Barlow Semi Condensed" w:eastAsia="Barlow Semi Condensed" w:hAnsi="Barlow Semi Condensed"/>
           <w:sz w:val="24"/>
           <w:szCs w:val="24"/>
         </w:rPr>
@@ -1038,7 +1038,7 @@
       </w:pPr>
       <w:r>
         <w:rPr>
-          <w:rFonts w:ascii="Times New Roman" w:cs="Times New Roman" w:eastAsia="Times New Roman" w:hAnsi="Times New Roman"/>
+          <w:rFonts w:ascii="Barlow Semi Condensed" w:cs="Barlow Semi Condensed" w:eastAsia="Barlow Semi Condensed" w:hAnsi="Barlow Semi Condensed"/>
           <w:b/>
           <w:bCs/>
           <w:sz w:val="24"/>
@@ -1048,7 +1048,7 @@
       </w:r>
       <w:r>
         <w:rPr>
-          <w:rFonts w:ascii="Times New Roman" w:cs="Times New Roman" w:eastAsia="Times New Roman" w:hAnsi="Times New Roman"/>
+          <w:rFonts w:ascii="Barlow Semi Condensed" w:cs="Barlow Semi Condensed" w:eastAsia="Barlow Semi Condensed" w:hAnsi="Barlow Semi Condensed"/>
           <w:sz w:val="24"/>
           <w:szCs w:val="24"/>
         </w:rPr>
@@ -1070,7 +1070,7 @@
       </w:pPr>
       <w:r>
         <w:rPr>
-          <w:rFonts w:ascii="Times New Roman" w:cs="Times New Roman" w:eastAsia="Times New Roman" w:hAnsi="Times New Roman"/>
+          <w:rFonts w:ascii="Barlow Semi Condensed" w:cs="Barlow Semi Condensed" w:eastAsia="Barlow Semi Condensed" w:hAnsi="Barlow Semi Condensed"/>
           <w:sz w:val="24"/>
           <w:szCs w:val="24"/>
         </w:rPr>
@@ -1084,7 +1084,7 @@
       </w:pPr>
       <w:r>
         <w:rPr>
-          <w:rFonts w:ascii="Times New Roman" w:cs="Times New Roman" w:eastAsia="Times New Roman" w:hAnsi="Times New Roman"/>
+          <w:rFonts w:ascii="Barlow Semi Condensed" w:cs="Barlow Semi Condensed" w:eastAsia="Barlow Semi Condensed" w:hAnsi="Barlow Semi Condensed"/>
           <w:i/>
           <w:iCs/>
           <w:sz w:val="24"/>
@@ -1100,7 +1100,7 @@
       </w:pPr>
       <w:r>
         <w:rPr>
-          <w:rFonts w:ascii="Times New Roman" w:cs="Times New Roman" w:eastAsia="Times New Roman" w:hAnsi="Times New Roman"/>
+          <w:rFonts w:ascii="Barlow Semi Condensed" w:cs="Barlow Semi Condensed" w:eastAsia="Barlow Semi Condensed" w:hAnsi="Barlow Semi Condensed"/>
           <w:sz w:val="24"/>
           <w:szCs w:val="24"/>
         </w:rPr>
@@ -1114,7 +1114,7 @@
       </w:pPr>
       <w:r>
         <w:rPr>
-          <w:rFonts w:ascii="Times New Roman" w:cs="Times New Roman" w:eastAsia="Times New Roman" w:hAnsi="Times New Roman"/>
+          <w:rFonts w:ascii="Barlow Semi Condensed" w:cs="Barlow Semi Condensed" w:eastAsia="Barlow Semi Condensed" w:hAnsi="Barlow Semi Condensed"/>
           <w:sz w:val="24"/>
           <w:szCs w:val="24"/>
         </w:rPr>
@@ -1122,7 +1122,7 @@
       </w:r>
       <w:r>
         <w:rPr>
-          <w:rFonts w:ascii="Times New Roman" w:cs="Times New Roman" w:eastAsia="Times New Roman" w:hAnsi="Times New Roman"/>
+          <w:rFonts w:ascii="Barlow Semi Condensed" w:cs="Barlow Semi Condensed" w:eastAsia="Barlow Semi Condensed" w:hAnsi="Barlow Semi Condensed"/>
           <w:i/>
           <w:iCs/>
           <w:sz w:val="24"/>
@@ -1138,7 +1138,7 @@
       </w:pPr>
       <w:r>
         <w:rPr>
-          <w:rFonts w:ascii="Times New Roman" w:cs="Times New Roman" w:eastAsia="Times New Roman" w:hAnsi="Times New Roman"/>
+          <w:rFonts w:ascii="Barlow Semi Condensed" w:cs="Barlow Semi Condensed" w:eastAsia="Barlow Semi Condensed" w:hAnsi="Barlow Semi Condensed"/>
           <w:sz w:val="24"/>
           <w:szCs w:val="24"/>
         </w:rPr>
@@ -1152,7 +1152,7 @@
       </w:pPr>
       <w:r>
         <w:rPr>
-          <w:rFonts w:ascii="Times New Roman" w:cs="Times New Roman" w:eastAsia="Times New Roman" w:hAnsi="Times New Roman"/>
+          <w:rFonts w:ascii="Barlow Semi Condensed" w:cs="Barlow Semi Condensed" w:eastAsia="Barlow Semi Condensed" w:hAnsi="Barlow Semi Condensed"/>
           <w:sz w:val="24"/>
           <w:szCs w:val="24"/>
         </w:rPr>
@@ -1160,7 +1160,7 @@
       </w:r>
       <w:r>
         <w:rPr>
-          <w:rFonts w:ascii="Times New Roman" w:cs="Times New Roman" w:eastAsia="Times New Roman" w:hAnsi="Times New Roman"/>
+          <w:rFonts w:ascii="Barlow Semi Condensed" w:cs="Barlow Semi Condensed" w:eastAsia="Barlow Semi Condensed" w:hAnsi="Barlow Semi Condensed"/>
           <w:i/>
           <w:iCs/>
           <w:sz w:val="24"/>
@@ -1176,7 +1176,7 @@
       </w:pPr>
       <w:r>
         <w:rPr>
-          <w:rFonts w:ascii="Times New Roman" w:cs="Times New Roman" w:eastAsia="Times New Roman" w:hAnsi="Times New Roman"/>
+          <w:rFonts w:ascii="Barlow Semi Condensed" w:cs="Barlow Semi Condensed" w:eastAsia="Barlow Semi Condensed" w:hAnsi="Barlow Semi Condensed"/>
           <w:sz w:val="24"/>
           <w:szCs w:val="24"/>
         </w:rPr>
@@ -1190,7 +1190,7 @@
       </w:pPr>
       <w:r>
         <w:rPr>
-          <w:rFonts w:ascii="Times New Roman" w:cs="Times New Roman" w:eastAsia="Times New Roman" w:hAnsi="Times New Roman"/>
+          <w:rFonts w:ascii="Barlow Semi Condensed" w:cs="Barlow Semi Condensed" w:eastAsia="Barlow Semi Condensed" w:hAnsi="Barlow Semi Condensed"/>
           <w:sz w:val="24"/>
           <w:szCs w:val="24"/>
         </w:rPr>
@@ -1198,7 +1198,7 @@
       </w:r>
       <w:r>
         <w:rPr>
-          <w:rFonts w:ascii="Times New Roman" w:cs="Times New Roman" w:eastAsia="Times New Roman" w:hAnsi="Times New Roman"/>
+          <w:rFonts w:ascii="Barlow Semi Condensed" w:cs="Barlow Semi Condensed" w:eastAsia="Barlow Semi Condensed" w:hAnsi="Barlow Semi Condensed"/>
           <w:i/>
           <w:iCs/>
           <w:sz w:val="24"/>
@@ -1214,7 +1214,7 @@
       </w:pPr>
       <w:r>
         <w:rPr>
-          <w:rFonts w:ascii="Times New Roman" w:cs="Times New Roman" w:eastAsia="Times New Roman" w:hAnsi="Times New Roman"/>
+          <w:rFonts w:ascii="Barlow Semi Condensed" w:cs="Barlow Semi Condensed" w:eastAsia="Barlow Semi Condensed" w:hAnsi="Barlow Semi Condensed"/>
           <w:sz w:val="24"/>
           <w:szCs w:val="24"/>
         </w:rPr>
@@ -1228,7 +1228,7 @@
       </w:pPr>
       <w:r>
         <w:rPr>
-          <w:rFonts w:ascii="Times New Roman" w:cs="Times New Roman" w:eastAsia="Times New Roman" w:hAnsi="Times New Roman"/>
+          <w:rFonts w:ascii="Barlow Semi Condensed" w:cs="Barlow Semi Condensed" w:eastAsia="Barlow Semi Condensed" w:hAnsi="Barlow Semi Condensed"/>
           <w:sz w:val="24"/>
           <w:szCs w:val="24"/>
         </w:rPr>
@@ -1236,7 +1236,7 @@
       </w:r>
       <w:r>
         <w:rPr>
-          <w:rFonts w:ascii="Times New Roman" w:cs="Times New Roman" w:eastAsia="Times New Roman" w:hAnsi="Times New Roman"/>
+          <w:rFonts w:ascii="Barlow Semi Condensed" w:cs="Barlow Semi Condensed" w:eastAsia="Barlow Semi Condensed" w:hAnsi="Barlow Semi Condensed"/>
           <w:b/>
           <w:bCs/>
           <w:sz w:val="24"/>
@@ -1246,7 +1246,7 @@
       </w:r>
       <w:r>
         <w:rPr>
-          <w:rFonts w:ascii="Times New Roman" w:cs="Times New Roman" w:eastAsia="Times New Roman" w:hAnsi="Times New Roman"/>
+          <w:rFonts w:ascii="Barlow Semi Condensed" w:cs="Barlow Semi Condensed" w:eastAsia="Barlow Semi Condensed" w:hAnsi="Barlow Semi Condensed"/>
           <w:sz w:val="24"/>
           <w:szCs w:val="24"/>
         </w:rPr>
@@ -1254,7 +1254,7 @@
       </w:r>
       <w:r>
         <w:rPr>
-          <w:rFonts w:ascii="Times New Roman" w:cs="Times New Roman" w:eastAsia="Times New Roman" w:hAnsi="Times New Roman"/>
+          <w:rFonts w:ascii="Barlow Semi Condensed" w:cs="Barlow Semi Condensed" w:eastAsia="Barlow Semi Condensed" w:hAnsi="Barlow Semi Condensed"/>
           <w:i/>
           <w:iCs/>
           <w:sz w:val="24"/>
@@ -1270,7 +1270,7 @@
       </w:pPr>
       <w:r>
         <w:rPr>
-          <w:rFonts w:ascii="Times New Roman" w:cs="Times New Roman" w:eastAsia="Times New Roman" w:hAnsi="Times New Roman"/>
+          <w:rFonts w:ascii="Barlow Semi Condensed" w:cs="Barlow Semi Condensed" w:eastAsia="Barlow Semi Condensed" w:hAnsi="Barlow Semi Condensed"/>
           <w:sz w:val="24"/>
           <w:szCs w:val="24"/>
         </w:rPr>
@@ -1284,7 +1284,7 @@
       </w:pPr>
       <w:r>
         <w:rPr>
-          <w:rFonts w:ascii="Times New Roman" w:cs="Times New Roman" w:eastAsia="Times New Roman" w:hAnsi="Times New Roman"/>
+          <w:rFonts w:ascii="Barlow Semi Condensed" w:cs="Barlow Semi Condensed" w:eastAsia="Barlow Semi Condensed" w:hAnsi="Barlow Semi Condensed"/>
           <w:sz w:val="24"/>
           <w:szCs w:val="24"/>
         </w:rPr>
@@ -1292,7 +1292,7 @@
       </w:r>
       <w:r>
         <w:rPr>
-          <w:rFonts w:ascii="Times New Roman" w:cs="Times New Roman" w:eastAsia="Times New Roman" w:hAnsi="Times New Roman"/>
+          <w:rFonts w:ascii="Barlow Semi Condensed" w:cs="Barlow Semi Condensed" w:eastAsia="Barlow Semi Condensed" w:hAnsi="Barlow Semi Condensed"/>
           <w:i/>
           <w:iCs/>
           <w:sz w:val="24"/>
@@ -1308,7 +1308,7 @@
       </w:pPr>
       <w:r>
         <w:rPr>
-          <w:rFonts w:ascii="Times New Roman" w:cs="Times New Roman" w:eastAsia="Times New Roman" w:hAnsi="Times New Roman"/>
+          <w:rFonts w:ascii="Barlow Semi Condensed" w:cs="Barlow Semi Condensed" w:eastAsia="Barlow Semi Condensed" w:hAnsi="Barlow Semi Condensed"/>
           <w:sz w:val="24"/>
           <w:szCs w:val="24"/>
         </w:rPr>
@@ -1322,7 +1322,7 @@
       </w:pPr>
       <w:r>
         <w:rPr>
-          <w:rFonts w:ascii="Times New Roman" w:cs="Times New Roman" w:eastAsia="Times New Roman" w:hAnsi="Times New Roman"/>
+          <w:rFonts w:ascii="Barlow Semi Condensed" w:cs="Barlow Semi Condensed" w:eastAsia="Barlow Semi Condensed" w:hAnsi="Barlow Semi Condensed"/>
           <w:sz w:val="24"/>
           <w:szCs w:val="24"/>
         </w:rPr>
@@ -1330,7 +1330,7 @@
       </w:r>
       <w:r>
         <w:rPr>
-          <w:rFonts w:ascii="Times New Roman" w:cs="Times New Roman" w:eastAsia="Times New Roman" w:hAnsi="Times New Roman"/>
+          <w:rFonts w:ascii="Barlow Semi Condensed" w:cs="Barlow Semi Condensed" w:eastAsia="Barlow Semi Condensed" w:hAnsi="Barlow Semi Condensed"/>
           <w:b/>
           <w:bCs/>
           <w:sz w:val="24"/>
@@ -1340,7 +1340,7 @@
       </w:r>
       <w:r>
         <w:rPr>
-          <w:rFonts w:ascii="Times New Roman" w:cs="Times New Roman" w:eastAsia="Times New Roman" w:hAnsi="Times New Roman"/>
+          <w:rFonts w:ascii="Barlow Semi Condensed" w:cs="Barlow Semi Condensed" w:eastAsia="Barlow Semi Condensed" w:hAnsi="Barlow Semi Condensed"/>
           <w:sz w:val="24"/>
           <w:szCs w:val="24"/>
         </w:rPr>
@@ -1348,7 +1348,7 @@
       </w:r>
       <w:r>
         <w:rPr>
-          <w:rFonts w:ascii="Times New Roman" w:cs="Times New Roman" w:eastAsia="Times New Roman" w:hAnsi="Times New Roman"/>
+          <w:rFonts w:ascii="Barlow Semi Condensed" w:cs="Barlow Semi Condensed" w:eastAsia="Barlow Semi Condensed" w:hAnsi="Barlow Semi Condensed"/>
           <w:i/>
           <w:iCs/>
           <w:sz w:val="24"/>
@@ -1364,7 +1364,7 @@
       </w:pPr>
       <w:r>
         <w:rPr>
-          <w:rFonts w:ascii="Times New Roman" w:cs="Times New Roman" w:eastAsia="Times New Roman" w:hAnsi="Times New Roman"/>
+          <w:rFonts w:ascii="Barlow Semi Condensed" w:cs="Barlow Semi Condensed" w:eastAsia="Barlow Semi Condensed" w:hAnsi="Barlow Semi Condensed"/>
           <w:b/>
           <w:bCs/>
           <w:sz w:val="24"/>
@@ -1374,7 +1374,7 @@
       </w:r>
       <w:r>
         <w:rPr>
-          <w:rFonts w:ascii="Times New Roman" w:cs="Times New Roman" w:eastAsia="Times New Roman" w:hAnsi="Times New Roman"/>
+          <w:rFonts w:ascii="Barlow Semi Condensed" w:cs="Barlow Semi Condensed" w:eastAsia="Barlow Semi Condensed" w:hAnsi="Barlow Semi Condensed"/>
           <w:sz w:val="24"/>
           <w:szCs w:val="24"/>
         </w:rPr>
@@ -1388,7 +1388,7 @@
       </w:pPr>
       <w:r>
         <w:rPr>
-          <w:rFonts w:ascii="Times New Roman" w:cs="Times New Roman" w:eastAsia="Times New Roman" w:hAnsi="Times New Roman"/>
+          <w:rFonts w:ascii="Barlow Semi Condensed" w:cs="Barlow Semi Condensed" w:eastAsia="Barlow Semi Condensed" w:hAnsi="Barlow Semi Condensed"/>
           <w:b/>
           <w:bCs/>
           <w:sz w:val="24"/>
@@ -1398,7 +1398,7 @@
       </w:r>
       <w:r>
         <w:rPr>
-          <w:rFonts w:ascii="Times New Roman" w:cs="Times New Roman" w:eastAsia="Times New Roman" w:hAnsi="Times New Roman"/>
+          <w:rFonts w:ascii="Barlow Semi Condensed" w:cs="Barlow Semi Condensed" w:eastAsia="Barlow Semi Condensed" w:hAnsi="Barlow Semi Condensed"/>
           <w:sz w:val="24"/>
           <w:szCs w:val="24"/>
         </w:rPr>
@@ -1412,7 +1412,7 @@
       </w:pPr>
       <w:r>
         <w:rPr>
-          <w:rFonts w:ascii="Times New Roman" w:cs="Times New Roman" w:eastAsia="Times New Roman" w:hAnsi="Times New Roman"/>
+          <w:rFonts w:ascii="Barlow Semi Condensed" w:cs="Barlow Semi Condensed" w:eastAsia="Barlow Semi Condensed" w:hAnsi="Barlow Semi Condensed"/>
           <w:b/>
           <w:bCs/>
           <w:sz w:val="24"/>
@@ -1422,7 +1422,7 @@
       </w:r>
       <w:r>
         <w:rPr>
-          <w:rFonts w:ascii="Times New Roman" w:cs="Times New Roman" w:eastAsia="Times New Roman" w:hAnsi="Times New Roman"/>
+          <w:rFonts w:ascii="Barlow Semi Condensed" w:cs="Barlow Semi Condensed" w:eastAsia="Barlow Semi Condensed" w:hAnsi="Barlow Semi Condensed"/>
           <w:sz w:val="24"/>
           <w:szCs w:val="24"/>
         </w:rPr>
@@ -1436,7 +1436,7 @@
       </w:pPr>
       <w:r>
         <w:rPr>
-          <w:rFonts w:ascii="Times New Roman" w:cs="Times New Roman" w:eastAsia="Times New Roman" w:hAnsi="Times New Roman"/>
+          <w:rFonts w:ascii="Barlow Semi Condensed" w:cs="Barlow Semi Condensed" w:eastAsia="Barlow Semi Condensed" w:hAnsi="Barlow Semi Condensed"/>
           <w:b/>
           <w:bCs/>
           <w:sz w:val="24"/>
@@ -1446,7 +1446,7 @@
       </w:r>
       <w:r>
         <w:rPr>
-          <w:rFonts w:ascii="Times New Roman" w:cs="Times New Roman" w:eastAsia="Times New Roman" w:hAnsi="Times New Roman"/>
+          <w:rFonts w:ascii="Barlow Semi Condensed" w:cs="Barlow Semi Condensed" w:eastAsia="Barlow Semi Condensed" w:hAnsi="Barlow Semi Condensed"/>
           <w:sz w:val="24"/>
           <w:szCs w:val="24"/>
         </w:rPr>
@@ -1460,7 +1460,7 @@
       </w:pPr>
       <w:r>
         <w:rPr>
-          <w:rFonts w:ascii="Times New Roman" w:cs="Times New Roman" w:eastAsia="Times New Roman" w:hAnsi="Times New Roman"/>
+          <w:rFonts w:ascii="Barlow Semi Condensed" w:cs="Barlow Semi Condensed" w:eastAsia="Barlow Semi Condensed" w:hAnsi="Barlow Semi Condensed"/>
           <w:b/>
           <w:bCs/>
           <w:sz w:val="24"/>
@@ -1470,7 +1470,7 @@
       </w:r>
       <w:r>
         <w:rPr>
-          <w:rFonts w:ascii="Times New Roman" w:cs="Times New Roman" w:eastAsia="Times New Roman" w:hAnsi="Times New Roman"/>
+          <w:rFonts w:ascii="Barlow Semi Condensed" w:cs="Barlow Semi Condensed" w:eastAsia="Barlow Semi Condensed" w:hAnsi="Barlow Semi Condensed"/>
           <w:sz w:val="24"/>
           <w:szCs w:val="24"/>
         </w:rPr>
@@ -1492,7 +1492,7 @@
       </w:pPr>
       <w:r>
         <w:rPr>
-          <w:rFonts w:ascii="Times New Roman" w:cs="Times New Roman" w:eastAsia="Times New Roman" w:hAnsi="Times New Roman"/>
+          <w:rFonts w:ascii="Barlow Semi Condensed" w:cs="Barlow Semi Condensed" w:eastAsia="Barlow Semi Condensed" w:hAnsi="Barlow Semi Condensed"/>
           <w:sz w:val="24"/>
           <w:szCs w:val="24"/>
         </w:rPr>
@@ -1506,7 +1506,7 @@
       </w:pPr>
       <w:r>
         <w:rPr>
-          <w:rFonts w:ascii="Times New Roman" w:cs="Times New Roman" w:eastAsia="Times New Roman" w:hAnsi="Times New Roman"/>
+          <w:rFonts w:ascii="Barlow Semi Condensed" w:cs="Barlow Semi Condensed" w:eastAsia="Barlow Semi Condensed" w:hAnsi="Barlow Semi Condensed"/>
           <w:i/>
           <w:iCs/>
           <w:sz w:val="24"/>
@@ -1522,7 +1522,7 @@
       </w:pPr>
       <w:r>
         <w:rPr>
-          <w:rFonts w:ascii="Times New Roman" w:cs="Times New Roman" w:eastAsia="Times New Roman" w:hAnsi="Times New Roman"/>
+          <w:rFonts w:ascii="Barlow Semi Condensed" w:cs="Barlow Semi Condensed" w:eastAsia="Barlow Semi Condensed" w:hAnsi="Barlow Semi Condensed"/>
           <w:sz w:val="24"/>
           <w:szCs w:val="24"/>
         </w:rPr>
@@ -1536,7 +1536,7 @@
       </w:pPr>
       <w:r>
         <w:rPr>
-          <w:rFonts w:ascii="Times New Roman" w:cs="Times New Roman" w:eastAsia="Times New Roman" w:hAnsi="Times New Roman"/>
+          <w:rFonts w:ascii="Barlow Semi Condensed" w:cs="Barlow Semi Condensed" w:eastAsia="Barlow Semi Condensed" w:hAnsi="Barlow Semi Condensed"/>
           <w:sz w:val="24"/>
           <w:szCs w:val="24"/>
         </w:rPr>
@@ -1544,7 +1544,7 @@
       </w:r>
       <w:r>
         <w:rPr>
-          <w:rFonts w:ascii="Times New Roman" w:cs="Times New Roman" w:eastAsia="Times New Roman" w:hAnsi="Times New Roman"/>
+          <w:rFonts w:ascii="Barlow Semi Condensed" w:cs="Barlow Semi Condensed" w:eastAsia="Barlow Semi Condensed" w:hAnsi="Barlow Semi Condensed"/>
           <w:i/>
           <w:iCs/>
           <w:sz w:val="24"/>
@@ -1560,7 +1560,7 @@
       </w:pPr>
       <w:r>
         <w:rPr>
-          <w:rFonts w:ascii="Times New Roman" w:cs="Times New Roman" w:eastAsia="Times New Roman" w:hAnsi="Times New Roman"/>
+          <w:rFonts w:ascii="Barlow Semi Condensed" w:cs="Barlow Semi Condensed" w:eastAsia="Barlow Semi Condensed" w:hAnsi="Barlow Semi Condensed"/>
           <w:sz w:val="24"/>
           <w:szCs w:val="24"/>
         </w:rPr>
@@ -1574,7 +1574,7 @@
       </w:pPr>
       <w:r>
         <w:rPr>
-          <w:rFonts w:ascii="Times New Roman" w:cs="Times New Roman" w:eastAsia="Times New Roman" w:hAnsi="Times New Roman"/>
+          <w:rFonts w:ascii="Barlow Semi Condensed" w:cs="Barlow Semi Condensed" w:eastAsia="Barlow Semi Condensed" w:hAnsi="Barlow Semi Condensed"/>
           <w:b/>
           <w:bCs/>
           <w:sz w:val="24"/>
@@ -1584,7 +1584,7 @@
       </w:r>
       <w:r>
         <w:rPr>
-          <w:rFonts w:ascii="Times New Roman" w:cs="Times New Roman" w:eastAsia="Times New Roman" w:hAnsi="Times New Roman"/>
+          <w:rFonts w:ascii="Barlow Semi Condensed" w:cs="Barlow Semi Condensed" w:eastAsia="Barlow Semi Condensed" w:hAnsi="Barlow Semi Condensed"/>
           <w:sz w:val="24"/>
           <w:szCs w:val="24"/>
         </w:rPr>
@@ -1592,7 +1592,7 @@
       </w:r>
       <w:r>
         <w:rPr>
-          <w:rFonts w:ascii="Times New Roman" w:cs="Times New Roman" w:eastAsia="Times New Roman" w:hAnsi="Times New Roman"/>
+          <w:rFonts w:ascii="Barlow Semi Condensed" w:cs="Barlow Semi Condensed" w:eastAsia="Barlow Semi Condensed" w:hAnsi="Barlow Semi Condensed"/>
           <w:i/>
           <w:iCs/>
           <w:sz w:val="24"/>
@@ -1608,7 +1608,7 @@
       </w:pPr>
       <w:r>
         <w:rPr>
-          <w:rFonts w:ascii="Times New Roman" w:cs="Times New Roman" w:eastAsia="Times New Roman" w:hAnsi="Times New Roman"/>
+          <w:rFonts w:ascii="Barlow Semi Condensed" w:cs="Barlow Semi Condensed" w:eastAsia="Barlow Semi Condensed" w:hAnsi="Barlow Semi Condensed"/>
           <w:sz w:val="24"/>
           <w:szCs w:val="24"/>
         </w:rPr>
@@ -1622,7 +1622,7 @@
       </w:pPr>
       <w:r>
         <w:rPr>
-          <w:rFonts w:ascii="Times New Roman" w:cs="Times New Roman" w:eastAsia="Times New Roman" w:hAnsi="Times New Roman"/>
+          <w:rFonts w:ascii="Barlow Semi Condensed" w:cs="Barlow Semi Condensed" w:eastAsia="Barlow Semi Condensed" w:hAnsi="Barlow Semi Condensed"/>
           <w:sz w:val="24"/>
           <w:szCs w:val="24"/>
         </w:rPr>
@@ -1630,7 +1630,7 @@
       </w:r>
       <w:r>
         <w:rPr>
-          <w:rFonts w:ascii="Times New Roman" w:cs="Times New Roman" w:eastAsia="Times New Roman" w:hAnsi="Times New Roman"/>
+          <w:rFonts w:ascii="Barlow Semi Condensed" w:cs="Barlow Semi Condensed" w:eastAsia="Barlow Semi Condensed" w:hAnsi="Barlow Semi Condensed"/>
           <w:i/>
           <w:iCs/>
           <w:sz w:val="24"/>
@@ -1646,7 +1646,7 @@
       </w:pPr>
       <w:r>
         <w:rPr>
-          <w:rFonts w:ascii="Times New Roman" w:cs="Times New Roman" w:eastAsia="Times New Roman" w:hAnsi="Times New Roman"/>
+          <w:rFonts w:ascii="Barlow Semi Condensed" w:cs="Barlow Semi Condensed" w:eastAsia="Barlow Semi Condensed" w:hAnsi="Barlow Semi Condensed"/>
           <w:sz w:val="24"/>
           <w:szCs w:val="24"/>
         </w:rPr>
@@ -1660,7 +1660,7 @@
       </w:pPr>
       <w:r>
         <w:rPr>
-          <w:rFonts w:ascii="Times New Roman" w:cs="Times New Roman" w:eastAsia="Times New Roman" w:hAnsi="Times New Roman"/>
+          <w:rFonts w:ascii="Barlow Semi Condensed" w:cs="Barlow Semi Condensed" w:eastAsia="Barlow Semi Condensed" w:hAnsi="Barlow Semi Condensed"/>
           <w:sz w:val="24"/>
           <w:szCs w:val="24"/>
         </w:rPr>
@@ -1668,7 +1668,7 @@
       </w:r>
       <w:r>
         <w:rPr>
-          <w:rFonts w:ascii="Times New Roman" w:cs="Times New Roman" w:eastAsia="Times New Roman" w:hAnsi="Times New Roman"/>
+          <w:rFonts w:ascii="Barlow Semi Condensed" w:cs="Barlow Semi Condensed" w:eastAsia="Barlow Semi Condensed" w:hAnsi="Barlow Semi Condensed"/>
           <w:i/>
           <w:iCs/>
           <w:sz w:val="24"/>
@@ -1684,7 +1684,7 @@
       </w:pPr>
       <w:r>
         <w:rPr>
-          <w:rFonts w:ascii="Times New Roman" w:cs="Times New Roman" w:eastAsia="Times New Roman" w:hAnsi="Times New Roman"/>
+          <w:rFonts w:ascii="Barlow Semi Condensed" w:cs="Barlow Semi Condensed" w:eastAsia="Barlow Semi Condensed" w:hAnsi="Barlow Semi Condensed"/>
           <w:sz w:val="24"/>
           <w:szCs w:val="24"/>
         </w:rPr>
@@ -1698,7 +1698,7 @@
       </w:pPr>
       <w:r>
         <w:rPr>
-          <w:rFonts w:ascii="Times New Roman" w:cs="Times New Roman" w:eastAsia="Times New Roman" w:hAnsi="Times New Roman"/>
+          <w:rFonts w:ascii="Barlow Semi Condensed" w:cs="Barlow Semi Condensed" w:eastAsia="Barlow Semi Condensed" w:hAnsi="Barlow Semi Condensed"/>
           <w:sz w:val="24"/>
           <w:szCs w:val="24"/>
         </w:rPr>
@@ -1706,7 +1706,7 @@
       </w:r>
       <w:r>
         <w:rPr>
-          <w:rFonts w:ascii="Times New Roman" w:cs="Times New Roman" w:eastAsia="Times New Roman" w:hAnsi="Times New Roman"/>
+          <w:rFonts w:ascii="Barlow Semi Condensed" w:cs="Barlow Semi Condensed" w:eastAsia="Barlow Semi Condensed" w:hAnsi="Barlow Semi Condensed"/>
           <w:i/>
           <w:iCs/>
           <w:sz w:val="24"/>
@@ -1722,7 +1722,7 @@
       </w:pPr>
       <w:r>
         <w:rPr>
-          <w:rFonts w:ascii="Times New Roman" w:cs="Times New Roman" w:eastAsia="Times New Roman" w:hAnsi="Times New Roman"/>
+          <w:rFonts w:ascii="Barlow Semi Condensed" w:cs="Barlow Semi Condensed" w:eastAsia="Barlow Semi Condensed" w:hAnsi="Barlow Semi Condensed"/>
           <w:sz w:val="24"/>
           <w:szCs w:val="24"/>
         </w:rPr>
@@ -1736,7 +1736,7 @@
       </w:pPr>
       <w:r>
         <w:rPr>
-          <w:rFonts w:ascii="Times New Roman" w:cs="Times New Roman" w:eastAsia="Times New Roman" w:hAnsi="Times New Roman"/>
+          <w:rFonts w:ascii="Barlow Semi Condensed" w:cs="Barlow Semi Condensed" w:eastAsia="Barlow Semi Condensed" w:hAnsi="Barlow Semi Condensed"/>
           <w:sz w:val="24"/>
           <w:szCs w:val="24"/>
         </w:rPr>
@@ -1744,7 +1744,7 @@
       </w:r>
       <w:r>
         <w:rPr>
-          <w:rFonts w:ascii="Times New Roman" w:cs="Times New Roman" w:eastAsia="Times New Roman" w:hAnsi="Times New Roman"/>
+          <w:rFonts w:ascii="Barlow Semi Condensed" w:cs="Barlow Semi Condensed" w:eastAsia="Barlow Semi Condensed" w:hAnsi="Barlow Semi Condensed"/>
           <w:b/>
           <w:bCs/>
           <w:sz w:val="24"/>
@@ -1754,7 +1754,7 @@
       </w:r>
       <w:r>
         <w:rPr>
-          <w:rFonts w:ascii="Times New Roman" w:cs="Times New Roman" w:eastAsia="Times New Roman" w:hAnsi="Times New Roman"/>
+          <w:rFonts w:ascii="Barlow Semi Condensed" w:cs="Barlow Semi Condensed" w:eastAsia="Barlow Semi Condensed" w:hAnsi="Barlow Semi Condensed"/>
           <w:sz w:val="24"/>
           <w:szCs w:val="24"/>
         </w:rPr>
@@ -1762,7 +1762,7 @@
       </w:r>
       <w:r>
         <w:rPr>
-          <w:rFonts w:ascii="Times New Roman" w:cs="Times New Roman" w:eastAsia="Times New Roman" w:hAnsi="Times New Roman"/>
+          <w:rFonts w:ascii="Barlow Semi Condensed" w:cs="Barlow Semi Condensed" w:eastAsia="Barlow Semi Condensed" w:hAnsi="Barlow Semi Condensed"/>
           <w:i/>
           <w:iCs/>
           <w:sz w:val="24"/>
@@ -1778,7 +1778,7 @@
       </w:pPr>
       <w:r>
         <w:rPr>
-          <w:rFonts w:ascii="Times New Roman" w:cs="Times New Roman" w:eastAsia="Times New Roman" w:hAnsi="Times New Roman"/>
+          <w:rFonts w:ascii="Barlow Semi Condensed" w:cs="Barlow Semi Condensed" w:eastAsia="Barlow Semi Condensed" w:hAnsi="Barlow Semi Condensed"/>
           <w:sz w:val="24"/>
           <w:szCs w:val="24"/>
         </w:rPr>
@@ -1792,7 +1792,7 @@
       </w:pPr>
       <w:r>
         <w:rPr>
-          <w:rFonts w:ascii="Times New Roman" w:cs="Times New Roman" w:eastAsia="Times New Roman" w:hAnsi="Times New Roman"/>
+          <w:rFonts w:ascii="Barlow Semi Condensed" w:cs="Barlow Semi Condensed" w:eastAsia="Barlow Semi Condensed" w:hAnsi="Barlow Semi Condensed"/>
           <w:sz w:val="24"/>
           <w:szCs w:val="24"/>
         </w:rPr>
@@ -1800,7 +1800,7 @@
       </w:r>
       <w:r>
         <w:rPr>
-          <w:rFonts w:ascii="Times New Roman" w:cs="Times New Roman" w:eastAsia="Times New Roman" w:hAnsi="Times New Roman"/>
+          <w:rFonts w:ascii="Barlow Semi Condensed" w:cs="Barlow Semi Condensed" w:eastAsia="Barlow Semi Condensed" w:hAnsi="Barlow Semi Condensed"/>
           <w:i/>
           <w:iCs/>
           <w:sz w:val="24"/>
@@ -1816,7 +1816,7 @@
       </w:pPr>
       <w:r>
         <w:rPr>
-          <w:rFonts w:ascii="Times New Roman" w:cs="Times New Roman" w:eastAsia="Times New Roman" w:hAnsi="Times New Roman"/>
+          <w:rFonts w:ascii="Barlow Semi Condensed" w:cs="Barlow Semi Condensed" w:eastAsia="Barlow Semi Condensed" w:hAnsi="Barlow Semi Condensed"/>
           <w:b/>
           <w:bCs/>
           <w:sz w:val="24"/>
@@ -1826,7 +1826,7 @@
       </w:r>
       <w:r>
         <w:rPr>
-          <w:rFonts w:ascii="Times New Roman" w:cs="Times New Roman" w:eastAsia="Times New Roman" w:hAnsi="Times New Roman"/>
+          <w:rFonts w:ascii="Barlow Semi Condensed" w:cs="Barlow Semi Condensed" w:eastAsia="Barlow Semi Condensed" w:hAnsi="Barlow Semi Condensed"/>
           <w:sz w:val="24"/>
           <w:szCs w:val="24"/>
         </w:rPr>
@@ -1840,7 +1840,7 @@
       </w:pPr>
       <w:r>
         <w:rPr>
-          <w:rFonts w:ascii="Times New Roman" w:cs="Times New Roman" w:eastAsia="Times New Roman" w:hAnsi="Times New Roman"/>
+          <w:rFonts w:ascii="Barlow Semi Condensed" w:cs="Barlow Semi Condensed" w:eastAsia="Barlow Semi Condensed" w:hAnsi="Barlow Semi Condensed"/>
           <w:b/>
           <w:bCs/>
           <w:sz w:val="24"/>
@@ -1850,7 +1850,7 @@
       </w:r>
       <w:r>
         <w:rPr>
-          <w:rFonts w:ascii="Times New Roman" w:cs="Times New Roman" w:eastAsia="Times New Roman" w:hAnsi="Times New Roman"/>
+          <w:rFonts w:ascii="Barlow Semi Condensed" w:cs="Barlow Semi Condensed" w:eastAsia="Barlow Semi Condensed" w:hAnsi="Barlow Semi Condensed"/>
           <w:sz w:val="24"/>
           <w:szCs w:val="24"/>
         </w:rPr>
@@ -1864,7 +1864,7 @@
       </w:pPr>
       <w:r>
         <w:rPr>
-          <w:rFonts w:ascii="Times New Roman" w:cs="Times New Roman" w:eastAsia="Times New Roman" w:hAnsi="Times New Roman"/>
+          <w:rFonts w:ascii="Barlow Semi Condensed" w:cs="Barlow Semi Condensed" w:eastAsia="Barlow Semi Condensed" w:hAnsi="Barlow Semi Condensed"/>
           <w:b/>
           <w:bCs/>
           <w:sz w:val="24"/>
@@ -1874,7 +1874,7 @@
       </w:r>
       <w:r>
         <w:rPr>
-          <w:rFonts w:ascii="Times New Roman" w:cs="Times New Roman" w:eastAsia="Times New Roman" w:hAnsi="Times New Roman"/>
+          <w:rFonts w:ascii="Barlow Semi Condensed" w:cs="Barlow Semi Condensed" w:eastAsia="Barlow Semi Condensed" w:hAnsi="Barlow Semi Condensed"/>
           <w:sz w:val="24"/>
           <w:szCs w:val="24"/>
         </w:rPr>
@@ -1888,7 +1888,7 @@
       </w:pPr>
       <w:r>
         <w:rPr>
-          <w:rFonts w:ascii="Times New Roman" w:cs="Times New Roman" w:eastAsia="Times New Roman" w:hAnsi="Times New Roman"/>
+          <w:rFonts w:ascii="Barlow Semi Condensed" w:cs="Barlow Semi Condensed" w:eastAsia="Barlow Semi Condensed" w:hAnsi="Barlow Semi Condensed"/>
           <w:b/>
           <w:bCs/>
           <w:sz w:val="24"/>
@@ -1898,7 +1898,7 @@
       </w:r>
       <w:r>
         <w:rPr>
-          <w:rFonts w:ascii="Times New Roman" w:cs="Times New Roman" w:eastAsia="Times New Roman" w:hAnsi="Times New Roman"/>
+          <w:rFonts w:ascii="Barlow Semi Condensed" w:cs="Barlow Semi Condensed" w:eastAsia="Barlow Semi Condensed" w:hAnsi="Barlow Semi Condensed"/>
           <w:sz w:val="24"/>
           <w:szCs w:val="24"/>
         </w:rPr>
@@ -1912,7 +1912,7 @@
       </w:pPr>
       <w:r>
         <w:rPr>
-          <w:rFonts w:ascii="Times New Roman" w:cs="Times New Roman" w:eastAsia="Times New Roman" w:hAnsi="Times New Roman"/>
+          <w:rFonts w:ascii="Barlow Semi Condensed" w:cs="Barlow Semi Condensed" w:eastAsia="Barlow Semi Condensed" w:hAnsi="Barlow Semi Condensed"/>
           <w:b/>
           <w:bCs/>
           <w:sz w:val="24"/>
@@ -1922,7 +1922,7 @@
       </w:r>
       <w:r>
         <w:rPr>
-          <w:rFonts w:ascii="Times New Roman" w:cs="Times New Roman" w:eastAsia="Times New Roman" w:hAnsi="Times New Roman"/>
+          <w:rFonts w:ascii="Barlow Semi Condensed" w:cs="Barlow Semi Condensed" w:eastAsia="Barlow Semi Condensed" w:hAnsi="Barlow Semi Condensed"/>
           <w:sz w:val="24"/>
           <w:szCs w:val="24"/>
         </w:rPr>
@@ -1944,7 +1944,7 @@
       </w:pPr>
       <w:r>
         <w:rPr>
-          <w:rFonts w:ascii="Times New Roman" w:cs="Times New Roman" w:eastAsia="Times New Roman" w:hAnsi="Times New Roman"/>
+          <w:rFonts w:ascii="Barlow Semi Condensed" w:cs="Barlow Semi Condensed" w:eastAsia="Barlow Semi Condensed" w:hAnsi="Barlow Semi Condensed"/>
           <w:sz w:val="24"/>
           <w:szCs w:val="24"/>
         </w:rPr>
@@ -1958,7 +1958,7 @@
       </w:pPr>
       <w:r>
         <w:rPr>
-          <w:rFonts w:ascii="Times New Roman" w:cs="Times New Roman" w:eastAsia="Times New Roman" w:hAnsi="Times New Roman"/>
+          <w:rFonts w:ascii="Barlow Semi Condensed" w:cs="Barlow Semi Condensed" w:eastAsia="Barlow Semi Condensed" w:hAnsi="Barlow Semi Condensed"/>
           <w:i/>
           <w:iCs/>
           <w:sz w:val="24"/>
@@ -1974,7 +1974,7 @@
       </w:pPr>
       <w:r>
         <w:rPr>
-          <w:rFonts w:ascii="Times New Roman" w:cs="Times New Roman" w:eastAsia="Times New Roman" w:hAnsi="Times New Roman"/>
+          <w:rFonts w:ascii="Barlow Semi Condensed" w:cs="Barlow Semi Condensed" w:eastAsia="Barlow Semi Condensed" w:hAnsi="Barlow Semi Condensed"/>
           <w:sz w:val="24"/>
           <w:szCs w:val="24"/>
         </w:rPr>
@@ -1988,7 +1988,7 @@
       </w:pPr>
       <w:r>
         <w:rPr>
-          <w:rFonts w:ascii="Times New Roman" w:cs="Times New Roman" w:eastAsia="Times New Roman" w:hAnsi="Times New Roman"/>
+          <w:rFonts w:ascii="Barlow Semi Condensed" w:cs="Barlow Semi Condensed" w:eastAsia="Barlow Semi Condensed" w:hAnsi="Barlow Semi Condensed"/>
           <w:sz w:val="24"/>
           <w:szCs w:val="24"/>
         </w:rPr>
@@ -1996,7 +1996,7 @@
       </w:r>
       <w:r>
         <w:rPr>
-          <w:rFonts w:ascii="Times New Roman" w:cs="Times New Roman" w:eastAsia="Times New Roman" w:hAnsi="Times New Roman"/>
+          <w:rFonts w:ascii="Barlow Semi Condensed" w:cs="Barlow Semi Condensed" w:eastAsia="Barlow Semi Condensed" w:hAnsi="Barlow Semi Condensed"/>
           <w:i/>
           <w:iCs/>
           <w:sz w:val="24"/>
@@ -2012,7 +2012,7 @@
       </w:pPr>
       <w:r>
         <w:rPr>
-          <w:rFonts w:ascii="Times New Roman" w:cs="Times New Roman" w:eastAsia="Times New Roman" w:hAnsi="Times New Roman"/>
+          <w:rFonts w:ascii="Barlow Semi Condensed" w:cs="Barlow Semi Condensed" w:eastAsia="Barlow Semi Condensed" w:hAnsi="Barlow Semi Condensed"/>
           <w:sz w:val="24"/>
           <w:szCs w:val="24"/>
         </w:rPr>
@@ -2026,7 +2026,7 @@
       </w:pPr>
       <w:r>
         <w:rPr>
-          <w:rFonts w:ascii="Times New Roman" w:cs="Times New Roman" w:eastAsia="Times New Roman" w:hAnsi="Times New Roman"/>
+          <w:rFonts w:ascii="Barlow Semi Condensed" w:cs="Barlow Semi Condensed" w:eastAsia="Barlow Semi Condensed" w:hAnsi="Barlow Semi Condensed"/>
           <w:sz w:val="24"/>
           <w:szCs w:val="24"/>
         </w:rPr>
@@ -2034,7 +2034,7 @@
       </w:r>
       <w:r>
         <w:rPr>
-          <w:rFonts w:ascii="Times New Roman" w:cs="Times New Roman" w:eastAsia="Times New Roman" w:hAnsi="Times New Roman"/>
+          <w:rFonts w:ascii="Barlow Semi Condensed" w:cs="Barlow Semi Condensed" w:eastAsia="Barlow Semi Condensed" w:hAnsi="Barlow Semi Condensed"/>
           <w:i/>
           <w:iCs/>
           <w:sz w:val="24"/>
@@ -2050,7 +2050,7 @@
       </w:pPr>
       <w:r>
         <w:rPr>
-          <w:rFonts w:ascii="Times New Roman" w:cs="Times New Roman" w:eastAsia="Times New Roman" w:hAnsi="Times New Roman"/>
+          <w:rFonts w:ascii="Barlow Semi Condensed" w:cs="Barlow Semi Condensed" w:eastAsia="Barlow Semi Condensed" w:hAnsi="Barlow Semi Condensed"/>
           <w:sz w:val="24"/>
           <w:szCs w:val="24"/>
         </w:rPr>
@@ -2064,7 +2064,7 @@
       </w:pPr>
       <w:r>
         <w:rPr>
-          <w:rFonts w:ascii="Times New Roman" w:cs="Times New Roman" w:eastAsia="Times New Roman" w:hAnsi="Times New Roman"/>
+          <w:rFonts w:ascii="Barlow Semi Condensed" w:cs="Barlow Semi Condensed" w:eastAsia="Barlow Semi Condensed" w:hAnsi="Barlow Semi Condensed"/>
           <w:sz w:val="24"/>
           <w:szCs w:val="24"/>
         </w:rPr>
@@ -2072,7 +2072,7 @@
       </w:r>
       <w:r>
         <w:rPr>
-          <w:rFonts w:ascii="Times New Roman" w:cs="Times New Roman" w:eastAsia="Times New Roman" w:hAnsi="Times New Roman"/>
+          <w:rFonts w:ascii="Barlow Semi Condensed" w:cs="Barlow Semi Condensed" w:eastAsia="Barlow Semi Condensed" w:hAnsi="Barlow Semi Condensed"/>
           <w:i/>
           <w:iCs/>
           <w:sz w:val="24"/>
@@ -2088,7 +2088,7 @@
       </w:pPr>
       <w:r>
         <w:rPr>
-          <w:rFonts w:ascii="Times New Roman" w:cs="Times New Roman" w:eastAsia="Times New Roman" w:hAnsi="Times New Roman"/>
+          <w:rFonts w:ascii="Barlow Semi Condensed" w:cs="Barlow Semi Condensed" w:eastAsia="Barlow Semi Condensed" w:hAnsi="Barlow Semi Condensed"/>
           <w:sz w:val="24"/>
           <w:szCs w:val="24"/>
         </w:rPr>
@@ -2102,7 +2102,7 @@
       </w:pPr>
       <w:r>
         <w:rPr>
-          <w:rFonts w:ascii="Times New Roman" w:cs="Times New Roman" w:eastAsia="Times New Roman" w:hAnsi="Times New Roman"/>
+          <w:rFonts w:ascii="Barlow Semi Condensed" w:cs="Barlow Semi Condensed" w:eastAsia="Barlow Semi Condensed" w:hAnsi="Barlow Semi Condensed"/>
           <w:sz w:val="24"/>
           <w:szCs w:val="24"/>
         </w:rPr>
@@ -2110,7 +2110,7 @@
       </w:r>
       <w:r>
         <w:rPr>
-          <w:rFonts w:ascii="Times New Roman" w:cs="Times New Roman" w:eastAsia="Times New Roman" w:hAnsi="Times New Roman"/>
+          <w:rFonts w:ascii="Barlow Semi Condensed" w:cs="Barlow Semi Condensed" w:eastAsia="Barlow Semi Condensed" w:hAnsi="Barlow Semi Condensed"/>
           <w:i/>
           <w:iCs/>
           <w:sz w:val="24"/>
@@ -2126,7 +2126,7 @@
       </w:pPr>
       <w:r>
         <w:rPr>
-          <w:rFonts w:ascii="Times New Roman" w:cs="Times New Roman" w:eastAsia="Times New Roman" w:hAnsi="Times New Roman"/>
+          <w:rFonts w:ascii="Barlow Semi Condensed" w:cs="Barlow Semi Condensed" w:eastAsia="Barlow Semi Condensed" w:hAnsi="Barlow Semi Condensed"/>
           <w:sz w:val="24"/>
           <w:szCs w:val="24"/>
         </w:rPr>
@@ -2140,7 +2140,7 @@
       </w:pPr>
       <w:r>
         <w:rPr>
-          <w:rFonts w:ascii="Times New Roman" w:cs="Times New Roman" w:eastAsia="Times New Roman" w:hAnsi="Times New Roman"/>
+          <w:rFonts w:ascii="Barlow Semi Condensed" w:cs="Barlow Semi Condensed" w:eastAsia="Barlow Semi Condensed" w:hAnsi="Barlow Semi Condensed"/>
           <w:sz w:val="24"/>
           <w:szCs w:val="24"/>
         </w:rPr>
@@ -2148,7 +2148,7 @@
       </w:r>
       <w:r>
         <w:rPr>
-          <w:rFonts w:ascii="Times New Roman" w:cs="Times New Roman" w:eastAsia="Times New Roman" w:hAnsi="Times New Roman"/>
+          <w:rFonts w:ascii="Barlow Semi Condensed" w:cs="Barlow Semi Condensed" w:eastAsia="Barlow Semi Condensed" w:hAnsi="Barlow Semi Condensed"/>
           <w:i/>
           <w:iCs/>
           <w:sz w:val="24"/>
@@ -2164,7 +2164,7 @@
       </w:pPr>
       <w:r>
         <w:rPr>
-          <w:rFonts w:ascii="Times New Roman" w:cs="Times New Roman" w:eastAsia="Times New Roman" w:hAnsi="Times New Roman"/>
+          <w:rFonts w:ascii="Barlow Semi Condensed" w:cs="Barlow Semi Condensed" w:eastAsia="Barlow Semi Condensed" w:hAnsi="Barlow Semi Condensed"/>
           <w:sz w:val="24"/>
           <w:szCs w:val="24"/>
         </w:rPr>
@@ -2178,7 +2178,7 @@
       </w:pPr>
       <w:r>
         <w:rPr>
-          <w:rFonts w:ascii="Times New Roman" w:cs="Times New Roman" w:eastAsia="Times New Roman" w:hAnsi="Times New Roman"/>
+          <w:rFonts w:ascii="Barlow Semi Condensed" w:cs="Barlow Semi Condensed" w:eastAsia="Barlow Semi Condensed" w:hAnsi="Barlow Semi Condensed"/>
           <w:sz w:val="24"/>
           <w:szCs w:val="24"/>
         </w:rPr>
@@ -2186,7 +2186,7 @@
       </w:r>
       <w:r>
         <w:rPr>
-          <w:rFonts w:ascii="Times New Roman" w:cs="Times New Roman" w:eastAsia="Times New Roman" w:hAnsi="Times New Roman"/>
+          <w:rFonts w:ascii="Barlow Semi Condensed" w:cs="Barlow Semi Condensed" w:eastAsia="Barlow Semi Condensed" w:hAnsi="Barlow Semi Condensed"/>
           <w:i/>
           <w:iCs/>
           <w:sz w:val="24"/>
@@ -2202,7 +2202,7 @@
       </w:pPr>
       <w:r>
         <w:rPr>
-          <w:rFonts w:ascii="Times New Roman" w:cs="Times New Roman" w:eastAsia="Times New Roman" w:hAnsi="Times New Roman"/>
+          <w:rFonts w:ascii="Barlow Semi Condensed" w:cs="Barlow Semi Condensed" w:eastAsia="Barlow Semi Condensed" w:hAnsi="Barlow Semi Condensed"/>
           <w:b/>
           <w:bCs/>
           <w:sz w:val="24"/>
@@ -2212,7 +2212,7 @@
       </w:r>
       <w:r>
         <w:rPr>
-          <w:rFonts w:ascii="Times New Roman" w:cs="Times New Roman" w:eastAsia="Times New Roman" w:hAnsi="Times New Roman"/>
+          <w:rFonts w:ascii="Barlow Semi Condensed" w:cs="Barlow Semi Condensed" w:eastAsia="Barlow Semi Condensed" w:hAnsi="Barlow Semi Condensed"/>
           <w:sz w:val="24"/>
           <w:szCs w:val="24"/>
         </w:rPr>
@@ -2226,7 +2226,7 @@
       </w:pPr>
       <w:r>
         <w:rPr>
-          <w:rFonts w:ascii="Times New Roman" w:cs="Times New Roman" w:eastAsia="Times New Roman" w:hAnsi="Times New Roman"/>
+          <w:rFonts w:ascii="Barlow Semi Condensed" w:cs="Barlow Semi Condensed" w:eastAsia="Barlow Semi Condensed" w:hAnsi="Barlow Semi Condensed"/>
           <w:b/>
           <w:bCs/>
           <w:sz w:val="24"/>
@@ -2236,7 +2236,7 @@
       </w:r>
       <w:r>
         <w:rPr>
-          <w:rFonts w:ascii="Times New Roman" w:cs="Times New Roman" w:eastAsia="Times New Roman" w:hAnsi="Times New Roman"/>
+          <w:rFonts w:ascii="Barlow Semi Condensed" w:cs="Barlow Semi Condensed" w:eastAsia="Barlow Semi Condensed" w:hAnsi="Barlow Semi Condensed"/>
           <w:sz w:val="24"/>
           <w:szCs w:val="24"/>
         </w:rPr>
@@ -2250,7 +2250,7 @@
       </w:pPr>
       <w:r>
         <w:rPr>
-          <w:rFonts w:ascii="Times New Roman" w:cs="Times New Roman" w:eastAsia="Times New Roman" w:hAnsi="Times New Roman"/>
+          <w:rFonts w:ascii="Barlow Semi Condensed" w:cs="Barlow Semi Condensed" w:eastAsia="Barlow Semi Condensed" w:hAnsi="Barlow Semi Condensed"/>
           <w:b/>
           <w:bCs/>
           <w:sz w:val="24"/>
@@ -2260,7 +2260,7 @@
       </w:r>
       <w:r>
         <w:rPr>
-          <w:rFonts w:ascii="Times New Roman" w:cs="Times New Roman" w:eastAsia="Times New Roman" w:hAnsi="Times New Roman"/>
+          <w:rFonts w:ascii="Barlow Semi Condensed" w:cs="Barlow Semi Condensed" w:eastAsia="Barlow Semi Condensed" w:hAnsi="Barlow Semi Condensed"/>
           <w:sz w:val="24"/>
           <w:szCs w:val="24"/>
         </w:rPr>
@@ -2274,7 +2274,7 @@
       </w:pPr>
       <w:r>
         <w:rPr>
-          <w:rFonts w:ascii="Times New Roman" w:cs="Times New Roman" w:eastAsia="Times New Roman" w:hAnsi="Times New Roman"/>
+          <w:rFonts w:ascii="Barlow Semi Condensed" w:cs="Barlow Semi Condensed" w:eastAsia="Barlow Semi Condensed" w:hAnsi="Barlow Semi Condensed"/>
           <w:b/>
           <w:bCs/>
           <w:sz w:val="24"/>
@@ -2284,7 +2284,7 @@
       </w:r>
       <w:r>
         <w:rPr>
-          <w:rFonts w:ascii="Times New Roman" w:cs="Times New Roman" w:eastAsia="Times New Roman" w:hAnsi="Times New Roman"/>
+          <w:rFonts w:ascii="Barlow Semi Condensed" w:cs="Barlow Semi Condensed" w:eastAsia="Barlow Semi Condensed" w:hAnsi="Barlow Semi Condensed"/>
           <w:sz w:val="24"/>
           <w:szCs w:val="24"/>
         </w:rPr>
@@ -2298,7 +2298,7 @@
       </w:pPr>
       <w:r>
         <w:rPr>
-          <w:rFonts w:ascii="Times New Roman" w:cs="Times New Roman" w:eastAsia="Times New Roman" w:hAnsi="Times New Roman"/>
+          <w:rFonts w:ascii="Barlow Semi Condensed" w:cs="Barlow Semi Condensed" w:eastAsia="Barlow Semi Condensed" w:hAnsi="Barlow Semi Condensed"/>
           <w:b/>
           <w:bCs/>
           <w:sz w:val="24"/>
@@ -2308,7 +2308,7 @@
       </w:r>
       <w:r>
         <w:rPr>
-          <w:rFonts w:ascii="Times New Roman" w:cs="Times New Roman" w:eastAsia="Times New Roman" w:hAnsi="Times New Roman"/>
+          <w:rFonts w:ascii="Barlow Semi Condensed" w:cs="Barlow Semi Condensed" w:eastAsia="Barlow Semi Condensed" w:hAnsi="Barlow Semi Condensed"/>
           <w:sz w:val="24"/>
           <w:szCs w:val="24"/>
         </w:rPr>
@@ -2330,7 +2330,7 @@
       </w:pPr>
       <w:r>
         <w:rPr>
-          <w:rFonts w:ascii="Times New Roman" w:cs="Times New Roman" w:eastAsia="Times New Roman" w:hAnsi="Times New Roman"/>
+          <w:rFonts w:ascii="Barlow Semi Condensed" w:cs="Barlow Semi Condensed" w:eastAsia="Barlow Semi Condensed" w:hAnsi="Barlow Semi Condensed"/>
           <w:sz w:val="24"/>
           <w:szCs w:val="24"/>
         </w:rPr>
@@ -2344,7 +2344,7 @@
       </w:pPr>
       <w:r>
         <w:rPr>
-          <w:rFonts w:ascii="Times New Roman" w:cs="Times New Roman" w:eastAsia="Times New Roman" w:hAnsi="Times New Roman"/>
+          <w:rFonts w:ascii="Barlow Semi Condensed" w:cs="Barlow Semi Condensed" w:eastAsia="Barlow Semi Condensed" w:hAnsi="Barlow Semi Condensed"/>
           <w:i/>
           <w:iCs/>
           <w:sz w:val="24"/>
@@ -2360,7 +2360,7 @@
       </w:pPr>
       <w:r>
         <w:rPr>
-          <w:rFonts w:ascii="Times New Roman" w:cs="Times New Roman" w:eastAsia="Times New Roman" w:hAnsi="Times New Roman"/>
+          <w:rFonts w:ascii="Barlow Semi Condensed" w:cs="Barlow Semi Condensed" w:eastAsia="Barlow Semi Condensed" w:hAnsi="Barlow Semi Condensed"/>
           <w:b/>
           <w:bCs/>
           <w:sz w:val="24"/>
@@ -2370,7 +2370,7 @@
       </w:r>
       <w:r>
         <w:rPr>
-          <w:rFonts w:ascii="Times New Roman" w:cs="Times New Roman" w:eastAsia="Times New Roman" w:hAnsi="Times New Roman"/>
+          <w:rFonts w:ascii="Barlow Semi Condensed" w:cs="Barlow Semi Condensed" w:eastAsia="Barlow Semi Condensed" w:hAnsi="Barlow Semi Condensed"/>
           <w:sz w:val="24"/>
           <w:szCs w:val="24"/>
         </w:rPr>
@@ -2378,7 +2378,7 @@
       </w:r>
       <w:r>
         <w:rPr>
-          <w:rFonts w:ascii="Times New Roman" w:cs="Times New Roman" w:eastAsia="Times New Roman" w:hAnsi="Times New Roman"/>
+          <w:rFonts w:ascii="Barlow Semi Condensed" w:cs="Barlow Semi Condensed" w:eastAsia="Barlow Semi Condensed" w:hAnsi="Barlow Semi Condensed"/>
           <w:b/>
           <w:bCs/>
           <w:sz w:val="24"/>
@@ -2388,7 +2388,7 @@
       </w:r>
       <w:r>
         <w:rPr>
-          <w:rFonts w:ascii="Times New Roman" w:cs="Times New Roman" w:eastAsia="Times New Roman" w:hAnsi="Times New Roman"/>
+          <w:rFonts w:ascii="Barlow Semi Condensed" w:cs="Barlow Semi Condensed" w:eastAsia="Barlow Semi Condensed" w:hAnsi="Barlow Semi Condensed"/>
           <w:sz w:val="24"/>
           <w:szCs w:val="24"/>
         </w:rPr>
@@ -2402,7 +2402,7 @@
       </w:pPr>
       <w:r>
         <w:rPr>
-          <w:rFonts w:ascii="Times New Roman" w:cs="Times New Roman" w:eastAsia="Times New Roman" w:hAnsi="Times New Roman"/>
+          <w:rFonts w:ascii="Barlow Semi Condensed" w:cs="Barlow Semi Condensed" w:eastAsia="Barlow Semi Condensed" w:hAnsi="Barlow Semi Condensed"/>
           <w:sz w:val="24"/>
           <w:szCs w:val="24"/>
         </w:rPr>
@@ -2416,7 +2416,7 @@
       </w:pPr>
       <w:r>
         <w:rPr>
-          <w:rFonts w:ascii="Times New Roman" w:cs="Times New Roman" w:eastAsia="Times New Roman" w:hAnsi="Times New Roman"/>
+          <w:rFonts w:ascii="Barlow Semi Condensed" w:cs="Barlow Semi Condensed" w:eastAsia="Barlow Semi Condensed" w:hAnsi="Barlow Semi Condensed"/>
           <w:sz w:val="24"/>
           <w:szCs w:val="24"/>
         </w:rPr>
@@ -2424,7 +2424,7 @@
       </w:r>
       <w:r>
         <w:rPr>
-          <w:rFonts w:ascii="Times New Roman" w:cs="Times New Roman" w:eastAsia="Times New Roman" w:hAnsi="Times New Roman"/>
+          <w:rFonts w:ascii="Barlow Semi Condensed" w:cs="Barlow Semi Condensed" w:eastAsia="Barlow Semi Condensed" w:hAnsi="Barlow Semi Condensed"/>
           <w:b/>
           <w:bCs/>
           <w:sz w:val="24"/>
@@ -2434,7 +2434,7 @@
       </w:r>
       <w:r>
         <w:rPr>
-          <w:rFonts w:ascii="Times New Roman" w:cs="Times New Roman" w:eastAsia="Times New Roman" w:hAnsi="Times New Roman"/>
+          <w:rFonts w:ascii="Barlow Semi Condensed" w:cs="Barlow Semi Condensed" w:eastAsia="Barlow Semi Condensed" w:hAnsi="Barlow Semi Condensed"/>
           <w:sz w:val="24"/>
           <w:szCs w:val="24"/>
         </w:rPr>
@@ -2442,7 +2442,7 @@
       </w:r>
       <w:r>
         <w:rPr>
-          <w:rFonts w:ascii="Times New Roman" w:cs="Times New Roman" w:eastAsia="Times New Roman" w:hAnsi="Times New Roman"/>
+          <w:rFonts w:ascii="Barlow Semi Condensed" w:cs="Barlow Semi Condensed" w:eastAsia="Barlow Semi Condensed" w:hAnsi="Barlow Semi Condensed"/>
           <w:b/>
           <w:bCs/>
           <w:sz w:val="24"/>
@@ -2452,7 +2452,7 @@
       </w:r>
       <w:r>
         <w:rPr>
-          <w:rFonts w:ascii="Times New Roman" w:cs="Times New Roman" w:eastAsia="Times New Roman" w:hAnsi="Times New Roman"/>
+          <w:rFonts w:ascii="Barlow Semi Condensed" w:cs="Barlow Semi Condensed" w:eastAsia="Barlow Semi Condensed" w:hAnsi="Barlow Semi Condensed"/>
           <w:sz w:val="24"/>
           <w:szCs w:val="24"/>
         </w:rPr>
@@ -2460,7 +2460,7 @@
       </w:r>
       <w:r>
         <w:rPr>
-          <w:rFonts w:ascii="Times New Roman" w:cs="Times New Roman" w:eastAsia="Times New Roman" w:hAnsi="Times New Roman"/>
+          <w:rFonts w:ascii="Barlow Semi Condensed" w:cs="Barlow Semi Condensed" w:eastAsia="Barlow Semi Condensed" w:hAnsi="Barlow Semi Condensed"/>
           <w:i/>
           <w:iCs/>
           <w:sz w:val="24"/>
@@ -2476,7 +2476,7 @@
       </w:pPr>
       <w:r>
         <w:rPr>
-          <w:rFonts w:ascii="Times New Roman" w:cs="Times New Roman" w:eastAsia="Times New Roman" w:hAnsi="Times New Roman"/>
+          <w:rFonts w:ascii="Barlow Semi Condensed" w:cs="Barlow Semi Condensed" w:eastAsia="Barlow Semi Condensed" w:hAnsi="Barlow Semi Condensed"/>
           <w:sz w:val="24"/>
           <w:szCs w:val="24"/>
         </w:rPr>
@@ -2490,7 +2490,7 @@
       </w:pPr>
       <w:r>
         <w:rPr>
-          <w:rFonts w:ascii="Times New Roman" w:cs="Times New Roman" w:eastAsia="Times New Roman" w:hAnsi="Times New Roman"/>
+          <w:rFonts w:ascii="Barlow Semi Condensed" w:cs="Barlow Semi Condensed" w:eastAsia="Barlow Semi Condensed" w:hAnsi="Barlow Semi Condensed"/>
           <w:sz w:val="24"/>
           <w:szCs w:val="24"/>
         </w:rPr>
@@ -2498,7 +2498,7 @@
       </w:r>
       <w:r>
         <w:rPr>
-          <w:rFonts w:ascii="Times New Roman" w:cs="Times New Roman" w:eastAsia="Times New Roman" w:hAnsi="Times New Roman"/>
+          <w:rFonts w:ascii="Barlow Semi Condensed" w:cs="Barlow Semi Condensed" w:eastAsia="Barlow Semi Condensed" w:hAnsi="Barlow Semi Condensed"/>
           <w:b/>
           <w:bCs/>
           <w:sz w:val="24"/>
@@ -2508,7 +2508,7 @@
       </w:r>
       <w:r>
         <w:rPr>
-          <w:rFonts w:ascii="Times New Roman" w:cs="Times New Roman" w:eastAsia="Times New Roman" w:hAnsi="Times New Roman"/>
+          <w:rFonts w:ascii="Barlow Semi Condensed" w:cs="Barlow Semi Condensed" w:eastAsia="Barlow Semi Condensed" w:hAnsi="Barlow Semi Condensed"/>
           <w:sz w:val="24"/>
           <w:szCs w:val="24"/>
         </w:rPr>
@@ -2516,7 +2516,7 @@
       </w:r>
       <w:r>
         <w:rPr>
-          <w:rFonts w:ascii="Times New Roman" w:cs="Times New Roman" w:eastAsia="Times New Roman" w:hAnsi="Times New Roman"/>
+          <w:rFonts w:ascii="Barlow Semi Condensed" w:cs="Barlow Semi Condensed" w:eastAsia="Barlow Semi Condensed" w:hAnsi="Barlow Semi Condensed"/>
           <w:b/>
           <w:bCs/>
           <w:sz w:val="24"/>
@@ -2526,7 +2526,7 @@
       </w:r>
       <w:r>
         <w:rPr>
-          <w:rFonts w:ascii="Times New Roman" w:cs="Times New Roman" w:eastAsia="Times New Roman" w:hAnsi="Times New Roman"/>
+          <w:rFonts w:ascii="Barlow Semi Condensed" w:cs="Barlow Semi Condensed" w:eastAsia="Barlow Semi Condensed" w:hAnsi="Barlow Semi Condensed"/>
           <w:sz w:val="24"/>
           <w:szCs w:val="24"/>
         </w:rPr>
@@ -2534,7 +2534,7 @@
       </w:r>
       <w:r>
         <w:rPr>
-          <w:rFonts w:ascii="Times New Roman" w:cs="Times New Roman" w:eastAsia="Times New Roman" w:hAnsi="Times New Roman"/>
+          <w:rFonts w:ascii="Barlow Semi Condensed" w:cs="Barlow Semi Condensed" w:eastAsia="Barlow Semi Condensed" w:hAnsi="Barlow Semi Condensed"/>
           <w:i/>
           <w:iCs/>
           <w:sz w:val="24"/>
@@ -2550,7 +2550,7 @@
       </w:pPr>
       <w:r>
         <w:rPr>
-          <w:rFonts w:ascii="Times New Roman" w:cs="Times New Roman" w:eastAsia="Times New Roman" w:hAnsi="Times New Roman"/>
+          <w:rFonts w:ascii="Barlow Semi Condensed" w:cs="Barlow Semi Condensed" w:eastAsia="Barlow Semi Condensed" w:hAnsi="Barlow Semi Condensed"/>
           <w:sz w:val="24"/>
           <w:szCs w:val="24"/>
         </w:rPr>
@@ -2564,7 +2564,7 @@
       </w:pPr>
       <w:r>
         <w:rPr>
-          <w:rFonts w:ascii="Times New Roman" w:cs="Times New Roman" w:eastAsia="Times New Roman" w:hAnsi="Times New Roman"/>
+          <w:rFonts w:ascii="Barlow Semi Condensed" w:cs="Barlow Semi Condensed" w:eastAsia="Barlow Semi Condensed" w:hAnsi="Barlow Semi Condensed"/>
           <w:sz w:val="24"/>
           <w:szCs w:val="24"/>
         </w:rPr>
@@ -2572,7 +2572,7 @@
       </w:r>
       <w:r>
         <w:rPr>
-          <w:rFonts w:ascii="Times New Roman" w:cs="Times New Roman" w:eastAsia="Times New Roman" w:hAnsi="Times New Roman"/>
+          <w:rFonts w:ascii="Barlow Semi Condensed" w:cs="Barlow Semi Condensed" w:eastAsia="Barlow Semi Condensed" w:hAnsi="Barlow Semi Condensed"/>
           <w:b/>
           <w:bCs/>
           <w:sz w:val="24"/>
@@ -2582,7 +2582,7 @@
       </w:r>
       <w:r>
         <w:rPr>
-          <w:rFonts w:ascii="Times New Roman" w:cs="Times New Roman" w:eastAsia="Times New Roman" w:hAnsi="Times New Roman"/>
+          <w:rFonts w:ascii="Barlow Semi Condensed" w:cs="Barlow Semi Condensed" w:eastAsia="Barlow Semi Condensed" w:hAnsi="Barlow Semi Condensed"/>
           <w:sz w:val="24"/>
           <w:szCs w:val="24"/>
         </w:rPr>
@@ -2590,7 +2590,7 @@
       </w:r>
       <w:r>
         <w:rPr>
-          <w:rFonts w:ascii="Times New Roman" w:cs="Times New Roman" w:eastAsia="Times New Roman" w:hAnsi="Times New Roman"/>
+          <w:rFonts w:ascii="Barlow Semi Condensed" w:cs="Barlow Semi Condensed" w:eastAsia="Barlow Semi Condensed" w:hAnsi="Barlow Semi Condensed"/>
           <w:i/>
           <w:iCs/>
           <w:sz w:val="24"/>
@@ -2606,7 +2606,7 @@
       </w:pPr>
       <w:r>
         <w:rPr>
-          <w:rFonts w:ascii="Times New Roman" w:cs="Times New Roman" w:eastAsia="Times New Roman" w:hAnsi="Times New Roman"/>
+          <w:rFonts w:ascii="Barlow Semi Condensed" w:cs="Barlow Semi Condensed" w:eastAsia="Barlow Semi Condensed" w:hAnsi="Barlow Semi Condensed"/>
           <w:sz w:val="24"/>
           <w:szCs w:val="24"/>
         </w:rPr>
@@ -2620,7 +2620,7 @@
       </w:pPr>
       <w:r>
         <w:rPr>
-          <w:rFonts w:ascii="Times New Roman" w:cs="Times New Roman" w:eastAsia="Times New Roman" w:hAnsi="Times New Roman"/>
+          <w:rFonts w:ascii="Barlow Semi Condensed" w:cs="Barlow Semi Condensed" w:eastAsia="Barlow Semi Condensed" w:hAnsi="Barlow Semi Condensed"/>
           <w:sz w:val="24"/>
           <w:szCs w:val="24"/>
         </w:rPr>
@@ -2628,7 +2628,7 @@
       </w:r>
       <w:r>
         <w:rPr>
-          <w:rFonts w:ascii="Times New Roman" w:cs="Times New Roman" w:eastAsia="Times New Roman" w:hAnsi="Times New Roman"/>
+          <w:rFonts w:ascii="Barlow Semi Condensed" w:cs="Barlow Semi Condensed" w:eastAsia="Barlow Semi Condensed" w:hAnsi="Barlow Semi Condensed"/>
           <w:i/>
           <w:iCs/>
           <w:sz w:val="24"/>
@@ -2638,7 +2638,7 @@
       </w:r>
       <w:r>
         <w:rPr>
-          <w:rFonts w:ascii="Times New Roman" w:cs="Times New Roman" w:eastAsia="Times New Roman" w:hAnsi="Times New Roman"/>
+          <w:rFonts w:ascii="Barlow Semi Condensed" w:cs="Barlow Semi Condensed" w:eastAsia="Barlow Semi Condensed" w:hAnsi="Barlow Semi Condensed"/>
           <w:sz w:val="24"/>
           <w:szCs w:val="24"/>
         </w:rPr>
@@ -2646,7 +2646,7 @@
       </w:r>
       <w:r>
         <w:rPr>
-          <w:rFonts w:ascii="Times New Roman" w:cs="Times New Roman" w:eastAsia="Times New Roman" w:hAnsi="Times New Roman"/>
+          <w:rFonts w:ascii="Barlow Semi Condensed" w:cs="Barlow Semi Condensed" w:eastAsia="Barlow Semi Condensed" w:hAnsi="Barlow Semi Condensed"/>
           <w:i/>
           <w:iCs/>
           <w:sz w:val="24"/>
@@ -2656,7 +2656,7 @@
       </w:r>
       <w:r>
         <w:rPr>
-          <w:rFonts w:ascii="Times New Roman" w:cs="Times New Roman" w:eastAsia="Times New Roman" w:hAnsi="Times New Roman"/>
+          <w:rFonts w:ascii="Barlow Semi Condensed" w:cs="Barlow Semi Condensed" w:eastAsia="Barlow Semi Condensed" w:hAnsi="Barlow Semi Condensed"/>
           <w:sz w:val="24"/>
           <w:szCs w:val="24"/>
         </w:rPr>
@@ -2664,7 +2664,7 @@
       </w:r>
       <w:r>
         <w:rPr>
-          <w:rFonts w:ascii="Times New Roman" w:cs="Times New Roman" w:eastAsia="Times New Roman" w:hAnsi="Times New Roman"/>
+          <w:rFonts w:ascii="Barlow Semi Condensed" w:cs="Barlow Semi Condensed" w:eastAsia="Barlow Semi Condensed" w:hAnsi="Barlow Semi Condensed"/>
           <w:b/>
           <w:bCs/>
           <w:sz w:val="24"/>
@@ -2674,7 +2674,7 @@
       </w:r>
       <w:r>
         <w:rPr>
-          <w:rFonts w:ascii="Times New Roman" w:cs="Times New Roman" w:eastAsia="Times New Roman" w:hAnsi="Times New Roman"/>
+          <w:rFonts w:ascii="Barlow Semi Condensed" w:cs="Barlow Semi Condensed" w:eastAsia="Barlow Semi Condensed" w:hAnsi="Barlow Semi Condensed"/>
           <w:sz w:val="24"/>
           <w:szCs w:val="24"/>
         </w:rPr>
@@ -2682,7 +2682,7 @@
       </w:r>
       <w:r>
         <w:rPr>
-          <w:rFonts w:ascii="Times New Roman" w:cs="Times New Roman" w:eastAsia="Times New Roman" w:hAnsi="Times New Roman"/>
+          <w:rFonts w:ascii="Barlow Semi Condensed" w:cs="Barlow Semi Condensed" w:eastAsia="Barlow Semi Condensed" w:hAnsi="Barlow Semi Condensed"/>
           <w:b/>
           <w:bCs/>
           <w:sz w:val="24"/>
@@ -2692,7 +2692,7 @@
       </w:r>
       <w:r>
         <w:rPr>
-          <w:rFonts w:ascii="Times New Roman" w:cs="Times New Roman" w:eastAsia="Times New Roman" w:hAnsi="Times New Roman"/>
+          <w:rFonts w:ascii="Barlow Semi Condensed" w:cs="Barlow Semi Condensed" w:eastAsia="Barlow Semi Condensed" w:hAnsi="Barlow Semi Condensed"/>
           <w:sz w:val="24"/>
           <w:szCs w:val="24"/>
         </w:rPr>
@@ -2700,7 +2700,7 @@
       </w:r>
       <w:r>
         <w:rPr>
-          <w:rFonts w:ascii="Times New Roman" w:cs="Times New Roman" w:eastAsia="Times New Roman" w:hAnsi="Times New Roman"/>
+          <w:rFonts w:ascii="Barlow Semi Condensed" w:cs="Barlow Semi Condensed" w:eastAsia="Barlow Semi Condensed" w:hAnsi="Barlow Semi Condensed"/>
           <w:b/>
           <w:bCs/>
           <w:sz w:val="24"/>
@@ -2710,7 +2710,7 @@
       </w:r>
       <w:r>
         <w:rPr>
-          <w:rFonts w:ascii="Times New Roman" w:cs="Times New Roman" w:eastAsia="Times New Roman" w:hAnsi="Times New Roman"/>
+          <w:rFonts w:ascii="Barlow Semi Condensed" w:cs="Barlow Semi Condensed" w:eastAsia="Barlow Semi Condensed" w:hAnsi="Barlow Semi Condensed"/>
           <w:sz w:val="24"/>
           <w:szCs w:val="24"/>
         </w:rPr>
@@ -2718,7 +2718,7 @@
       </w:r>
       <w:r>
         <w:rPr>
-          <w:rFonts w:ascii="Times New Roman" w:cs="Times New Roman" w:eastAsia="Times New Roman" w:hAnsi="Times New Roman"/>
+          <w:rFonts w:ascii="Barlow Semi Condensed" w:cs="Barlow Semi Condensed" w:eastAsia="Barlow Semi Condensed" w:hAnsi="Barlow Semi Condensed"/>
           <w:i/>
           <w:iCs/>
           <w:sz w:val="24"/>
@@ -2734,7 +2734,7 @@
       </w:pPr>
       <w:r>
         <w:rPr>
-          <w:rFonts w:ascii="Times New Roman" w:cs="Times New Roman" w:eastAsia="Times New Roman" w:hAnsi="Times New Roman"/>
+          <w:rFonts w:ascii="Barlow Semi Condensed" w:cs="Barlow Semi Condensed" w:eastAsia="Barlow Semi Condensed" w:hAnsi="Barlow Semi Condensed"/>
           <w:sz w:val="24"/>
           <w:szCs w:val="24"/>
         </w:rPr>
@@ -2748,7 +2748,7 @@
       </w:pPr>
       <w:r>
         <w:rPr>
-          <w:rFonts w:ascii="Times New Roman" w:cs="Times New Roman" w:eastAsia="Times New Roman" w:hAnsi="Times New Roman"/>
+          <w:rFonts w:ascii="Barlow Semi Condensed" w:cs="Barlow Semi Condensed" w:eastAsia="Barlow Semi Condensed" w:hAnsi="Barlow Semi Condensed"/>
           <w:sz w:val="24"/>
           <w:szCs w:val="24"/>
         </w:rPr>
@@ -2756,7 +2756,7 @@
       </w:r>
       <w:r>
         <w:rPr>
-          <w:rFonts w:ascii="Times New Roman" w:cs="Times New Roman" w:eastAsia="Times New Roman" w:hAnsi="Times New Roman"/>
+          <w:rFonts w:ascii="Barlow Semi Condensed" w:cs="Barlow Semi Condensed" w:eastAsia="Barlow Semi Condensed" w:hAnsi="Barlow Semi Condensed"/>
           <w:i/>
           <w:iCs/>
           <w:sz w:val="24"/>
@@ -2772,7 +2772,7 @@
       </w:pPr>
       <w:r>
         <w:rPr>
-          <w:rFonts w:ascii="Times New Roman" w:cs="Times New Roman" w:eastAsia="Times New Roman" w:hAnsi="Times New Roman"/>
+          <w:rFonts w:ascii="Barlow Semi Condensed" w:cs="Barlow Semi Condensed" w:eastAsia="Barlow Semi Condensed" w:hAnsi="Barlow Semi Condensed"/>
           <w:b/>
           <w:bCs/>
           <w:sz w:val="24"/>
@@ -2782,7 +2782,7 @@
       </w:r>
       <w:r>
         <w:rPr>
-          <w:rFonts w:ascii="Times New Roman" w:cs="Times New Roman" w:eastAsia="Times New Roman" w:hAnsi="Times New Roman"/>
+          <w:rFonts w:ascii="Barlow Semi Condensed" w:cs="Barlow Semi Condensed" w:eastAsia="Barlow Semi Condensed" w:hAnsi="Barlow Semi Condensed"/>
           <w:sz w:val="24"/>
           <w:szCs w:val="24"/>
         </w:rPr>
@@ -2796,7 +2796,7 @@
       </w:pPr>
       <w:r>
         <w:rPr>
-          <w:rFonts w:ascii="Times New Roman" w:cs="Times New Roman" w:eastAsia="Times New Roman" w:hAnsi="Times New Roman"/>
+          <w:rFonts w:ascii="Barlow Semi Condensed" w:cs="Barlow Semi Condensed" w:eastAsia="Barlow Semi Condensed" w:hAnsi="Barlow Semi Condensed"/>
           <w:b/>
           <w:bCs/>
           <w:sz w:val="24"/>
@@ -2806,7 +2806,7 @@
       </w:r>
       <w:r>
         <w:rPr>
-          <w:rFonts w:ascii="Times New Roman" w:cs="Times New Roman" w:eastAsia="Times New Roman" w:hAnsi="Times New Roman"/>
+          <w:rFonts w:ascii="Barlow Semi Condensed" w:cs="Barlow Semi Condensed" w:eastAsia="Barlow Semi Condensed" w:hAnsi="Barlow Semi Condensed"/>
           <w:sz w:val="24"/>
           <w:szCs w:val="24"/>
         </w:rPr>
@@ -2820,7 +2820,7 @@
       </w:pPr>
       <w:r>
         <w:rPr>
-          <w:rFonts w:ascii="Times New Roman" w:cs="Times New Roman" w:eastAsia="Times New Roman" w:hAnsi="Times New Roman"/>
+          <w:rFonts w:ascii="Barlow Semi Condensed" w:cs="Barlow Semi Condensed" w:eastAsia="Barlow Semi Condensed" w:hAnsi="Barlow Semi Condensed"/>
           <w:b/>
           <w:bCs/>
           <w:sz w:val="24"/>
@@ -2830,7 +2830,7 @@
       </w:r>
       <w:r>
         <w:rPr>
-          <w:rFonts w:ascii="Times New Roman" w:cs="Times New Roman" w:eastAsia="Times New Roman" w:hAnsi="Times New Roman"/>
+          <w:rFonts w:ascii="Barlow Semi Condensed" w:cs="Barlow Semi Condensed" w:eastAsia="Barlow Semi Condensed" w:hAnsi="Barlow Semi Condensed"/>
           <w:sz w:val="24"/>
           <w:szCs w:val="24"/>
         </w:rPr>
@@ -2844,7 +2844,7 @@
       </w:pPr>
       <w:r>
         <w:rPr>
-          <w:rFonts w:ascii="Times New Roman" w:cs="Times New Roman" w:eastAsia="Times New Roman" w:hAnsi="Times New Roman"/>
+          <w:rFonts w:ascii="Barlow Semi Condensed" w:cs="Barlow Semi Condensed" w:eastAsia="Barlow Semi Condensed" w:hAnsi="Barlow Semi Condensed"/>
           <w:b/>
           <w:bCs/>
           <w:sz w:val="24"/>
@@ -2854,7 +2854,7 @@
       </w:r>
       <w:r>
         <w:rPr>
-          <w:rFonts w:ascii="Times New Roman" w:cs="Times New Roman" w:eastAsia="Times New Roman" w:hAnsi="Times New Roman"/>
+          <w:rFonts w:ascii="Barlow Semi Condensed" w:cs="Barlow Semi Condensed" w:eastAsia="Barlow Semi Condensed" w:hAnsi="Barlow Semi Condensed"/>
           <w:sz w:val="24"/>
           <w:szCs w:val="24"/>
         </w:rPr>
@@ -2868,7 +2868,7 @@
       </w:pPr>
       <w:r>
         <w:rPr>
-          <w:rFonts w:ascii="Times New Roman" w:cs="Times New Roman" w:eastAsia="Times New Roman" w:hAnsi="Times New Roman"/>
+          <w:rFonts w:ascii="Barlow Semi Condensed" w:cs="Barlow Semi Condensed" w:eastAsia="Barlow Semi Condensed" w:hAnsi="Barlow Semi Condensed"/>
           <w:b/>
           <w:bCs/>
           <w:sz w:val="24"/>
@@ -2878,7 +2878,7 @@
       </w:r>
       <w:r>
         <w:rPr>
-          <w:rFonts w:ascii="Times New Roman" w:cs="Times New Roman" w:eastAsia="Times New Roman" w:hAnsi="Times New Roman"/>
+          <w:rFonts w:ascii="Barlow Semi Condensed" w:cs="Barlow Semi Condensed" w:eastAsia="Barlow Semi Condensed" w:hAnsi="Barlow Semi Condensed"/>
           <w:sz w:val="24"/>
           <w:szCs w:val="24"/>
         </w:rPr>
@@ -2900,7 +2900,7 @@
       </w:pPr>
       <w:r>
         <w:rPr>
-          <w:rFonts w:ascii="Times New Roman" w:cs="Times New Roman" w:eastAsia="Times New Roman" w:hAnsi="Times New Roman"/>
+          <w:rFonts w:ascii="Barlow Semi Condensed" w:cs="Barlow Semi Condensed" w:eastAsia="Barlow Semi Condensed" w:hAnsi="Barlow Semi Condensed"/>
           <w:sz w:val="24"/>
           <w:szCs w:val="24"/>
         </w:rPr>
@@ -2914,7 +2914,7 @@
       </w:pPr>
       <w:r>
         <w:rPr>
-          <w:rFonts w:ascii="Times New Roman" w:cs="Times New Roman" w:eastAsia="Times New Roman" w:hAnsi="Times New Roman"/>
+          <w:rFonts w:ascii="Barlow Semi Condensed" w:cs="Barlow Semi Condensed" w:eastAsia="Barlow Semi Condensed" w:hAnsi="Barlow Semi Condensed"/>
           <w:sz w:val="24"/>
           <w:szCs w:val="24"/>
         </w:rPr>
@@ -2928,7 +2928,7 @@
       </w:pPr>
       <w:r>
         <w:rPr>
-          <w:rFonts w:ascii="Times New Roman" w:cs="Times New Roman" w:eastAsia="Times New Roman" w:hAnsi="Times New Roman"/>
+          <w:rFonts w:ascii="Barlow Semi Condensed" w:cs="Barlow Semi Condensed" w:eastAsia="Barlow Semi Condensed" w:hAnsi="Barlow Semi Condensed"/>
           <w:b/>
           <w:bCs/>
           <w:sz w:val="24"/>
@@ -2938,7 +2938,7 @@
       </w:r>
       <w:r>
         <w:rPr>
-          <w:rFonts w:ascii="Times New Roman" w:cs="Times New Roman" w:eastAsia="Times New Roman" w:hAnsi="Times New Roman"/>
+          <w:rFonts w:ascii="Barlow Semi Condensed" w:cs="Barlow Semi Condensed" w:eastAsia="Barlow Semi Condensed" w:hAnsi="Barlow Semi Condensed"/>
           <w:sz w:val="24"/>
           <w:szCs w:val="24"/>
         </w:rPr>
@@ -2946,7 +2946,7 @@
       </w:r>
       <w:r>
         <w:rPr>
-          <w:rFonts w:ascii="Times New Roman" w:cs="Times New Roman" w:eastAsia="Times New Roman" w:hAnsi="Times New Roman"/>
+          <w:rFonts w:ascii="Barlow Semi Condensed" w:cs="Barlow Semi Condensed" w:eastAsia="Barlow Semi Condensed" w:hAnsi="Barlow Semi Condensed"/>
           <w:b/>
           <w:bCs/>
           <w:sz w:val="24"/>
@@ -2956,7 +2956,7 @@
       </w:r>
       <w:r>
         <w:rPr>
-          <w:rFonts w:ascii="Times New Roman" w:cs="Times New Roman" w:eastAsia="Times New Roman" w:hAnsi="Times New Roman"/>
+          <w:rFonts w:ascii="Barlow Semi Condensed" w:cs="Barlow Semi Condensed" w:eastAsia="Barlow Semi Condensed" w:hAnsi="Barlow Semi Condensed"/>
           <w:sz w:val="24"/>
           <w:szCs w:val="24"/>
         </w:rPr>
@@ -2964,7 +2964,7 @@
       </w:r>
       <w:r>
         <w:rPr>
-          <w:rFonts w:ascii="Times New Roman" w:cs="Times New Roman" w:eastAsia="Times New Roman" w:hAnsi="Times New Roman"/>
+          <w:rFonts w:ascii="Barlow Semi Condensed" w:cs="Barlow Semi Condensed" w:eastAsia="Barlow Semi Condensed" w:hAnsi="Barlow Semi Condensed"/>
           <w:b/>
           <w:bCs/>
           <w:sz w:val="24"/>
@@ -2974,7 +2974,7 @@
       </w:r>
       <w:r>
         <w:rPr>
-          <w:rFonts w:ascii="Times New Roman" w:cs="Times New Roman" w:eastAsia="Times New Roman" w:hAnsi="Times New Roman"/>
+          <w:rFonts w:ascii="Barlow Semi Condensed" w:cs="Barlow Semi Condensed" w:eastAsia="Barlow Semi Condensed" w:hAnsi="Barlow Semi Condensed"/>
           <w:sz w:val="24"/>
           <w:szCs w:val="24"/>
         </w:rPr>
@@ -2982,7 +2982,7 @@
       </w:r>
       <w:r>
         <w:rPr>
-          <w:rFonts w:ascii="Times New Roman" w:cs="Times New Roman" w:eastAsia="Times New Roman" w:hAnsi="Times New Roman"/>
+          <w:rFonts w:ascii="Barlow Semi Condensed" w:cs="Barlow Semi Condensed" w:eastAsia="Barlow Semi Condensed" w:hAnsi="Barlow Semi Condensed"/>
           <w:b/>
           <w:bCs/>
           <w:sz w:val="24"/>
@@ -2992,7 +2992,7 @@
       </w:r>
       <w:r>
         <w:rPr>
-          <w:rFonts w:ascii="Times New Roman" w:cs="Times New Roman" w:eastAsia="Times New Roman" w:hAnsi="Times New Roman"/>
+          <w:rFonts w:ascii="Barlow Semi Condensed" w:cs="Barlow Semi Condensed" w:eastAsia="Barlow Semi Condensed" w:hAnsi="Barlow Semi Condensed"/>
           <w:sz w:val="24"/>
           <w:szCs w:val="24"/>
         </w:rPr>
@@ -3000,7 +3000,7 @@
       </w:r>
       <w:r>
         <w:rPr>
-          <w:rFonts w:ascii="Times New Roman" w:cs="Times New Roman" w:eastAsia="Times New Roman" w:hAnsi="Times New Roman"/>
+          <w:rFonts w:ascii="Barlow Semi Condensed" w:cs="Barlow Semi Condensed" w:eastAsia="Barlow Semi Condensed" w:hAnsi="Barlow Semi Condensed"/>
           <w:b/>
           <w:bCs/>
           <w:sz w:val="24"/>
@@ -3010,7 +3010,7 @@
       </w:r>
       <w:r>
         <w:rPr>
-          <w:rFonts w:ascii="Times New Roman" w:cs="Times New Roman" w:eastAsia="Times New Roman" w:hAnsi="Times New Roman"/>
+          <w:rFonts w:ascii="Barlow Semi Condensed" w:cs="Barlow Semi Condensed" w:eastAsia="Barlow Semi Condensed" w:hAnsi="Barlow Semi Condensed"/>
           <w:sz w:val="24"/>
           <w:szCs w:val="24"/>
         </w:rPr>
@@ -3018,7 +3018,7 @@
       </w:r>
       <w:r>
         <w:rPr>
-          <w:rFonts w:ascii="Times New Roman" w:cs="Times New Roman" w:eastAsia="Times New Roman" w:hAnsi="Times New Roman"/>
+          <w:rFonts w:ascii="Barlow Semi Condensed" w:cs="Barlow Semi Condensed" w:eastAsia="Barlow Semi Condensed" w:hAnsi="Barlow Semi Condensed"/>
           <w:b/>
           <w:bCs/>
           <w:sz w:val="24"/>
@@ -3028,7 +3028,7 @@
       </w:r>
       <w:r>
         <w:rPr>
-          <w:rFonts w:ascii="Times New Roman" w:cs="Times New Roman" w:eastAsia="Times New Roman" w:hAnsi="Times New Roman"/>
+          <w:rFonts w:ascii="Barlow Semi Condensed" w:cs="Barlow Semi Condensed" w:eastAsia="Barlow Semi Condensed" w:hAnsi="Barlow Semi Condensed"/>
           <w:sz w:val="24"/>
           <w:szCs w:val="24"/>
         </w:rPr>
@@ -3036,7 +3036,7 @@
       </w:r>
       <w:r>
         <w:rPr>
-          <w:rFonts w:ascii="Times New Roman" w:cs="Times New Roman" w:eastAsia="Times New Roman" w:hAnsi="Times New Roman"/>
+          <w:rFonts w:ascii="Barlow Semi Condensed" w:cs="Barlow Semi Condensed" w:eastAsia="Barlow Semi Condensed" w:hAnsi="Barlow Semi Condensed"/>
           <w:b/>
           <w:bCs/>
           <w:sz w:val="24"/>
@@ -3046,7 +3046,7 @@
       </w:r>
       <w:r>
         <w:rPr>
-          <w:rFonts w:ascii="Times New Roman" w:cs="Times New Roman" w:eastAsia="Times New Roman" w:hAnsi="Times New Roman"/>
+          <w:rFonts w:ascii="Barlow Semi Condensed" w:cs="Barlow Semi Condensed" w:eastAsia="Barlow Semi Condensed" w:hAnsi="Barlow Semi Condensed"/>
           <w:sz w:val="24"/>
           <w:szCs w:val="24"/>
         </w:rPr>
@@ -3054,7 +3054,7 @@
       </w:r>
       <w:r>
         <w:rPr>
-          <w:rFonts w:ascii="Times New Roman" w:cs="Times New Roman" w:eastAsia="Times New Roman" w:hAnsi="Times New Roman"/>
+          <w:rFonts w:ascii="Barlow Semi Condensed" w:cs="Barlow Semi Condensed" w:eastAsia="Barlow Semi Condensed" w:hAnsi="Barlow Semi Condensed"/>
           <w:b/>
           <w:bCs/>
           <w:sz w:val="24"/>
@@ -3064,7 +3064,7 @@
       </w:r>
       <w:r>
         <w:rPr>
-          <w:rFonts w:ascii="Times New Roman" w:cs="Times New Roman" w:eastAsia="Times New Roman" w:hAnsi="Times New Roman"/>
+          <w:rFonts w:ascii="Barlow Semi Condensed" w:cs="Barlow Semi Condensed" w:eastAsia="Barlow Semi Condensed" w:hAnsi="Barlow Semi Condensed"/>
           <w:sz w:val="24"/>
           <w:szCs w:val="24"/>
         </w:rPr>
@@ -3072,7 +3072,7 @@
       </w:r>
       <w:r>
         <w:rPr>
-          <w:rFonts w:ascii="Times New Roman" w:cs="Times New Roman" w:eastAsia="Times New Roman" w:hAnsi="Times New Roman"/>
+          <w:rFonts w:ascii="Barlow Semi Condensed" w:cs="Barlow Semi Condensed" w:eastAsia="Barlow Semi Condensed" w:hAnsi="Barlow Semi Condensed"/>
           <w:b/>
           <w:bCs/>
           <w:sz w:val="24"/>
@@ -3082,7 +3082,7 @@
       </w:r>
       <w:r>
         <w:rPr>
-          <w:rFonts w:ascii="Times New Roman" w:cs="Times New Roman" w:eastAsia="Times New Roman" w:hAnsi="Times New Roman"/>
+          <w:rFonts w:ascii="Barlow Semi Condensed" w:cs="Barlow Semi Condensed" w:eastAsia="Barlow Semi Condensed" w:hAnsi="Barlow Semi Condensed"/>
           <w:sz w:val="24"/>
           <w:szCs w:val="24"/>
         </w:rPr>
@@ -3090,7 +3090,7 @@
       </w:r>
       <w:r>
         <w:rPr>
-          <w:rFonts w:ascii="Times New Roman" w:cs="Times New Roman" w:eastAsia="Times New Roman" w:hAnsi="Times New Roman"/>
+          <w:rFonts w:ascii="Barlow Semi Condensed" w:cs="Barlow Semi Condensed" w:eastAsia="Barlow Semi Condensed" w:hAnsi="Barlow Semi Condensed"/>
           <w:b/>
           <w:bCs/>
           <w:sz w:val="24"/>
@@ -3100,7 +3100,7 @@
       </w:r>
       <w:r>
         <w:rPr>
-          <w:rFonts w:ascii="Times New Roman" w:cs="Times New Roman" w:eastAsia="Times New Roman" w:hAnsi="Times New Roman"/>
+          <w:rFonts w:ascii="Barlow Semi Condensed" w:cs="Barlow Semi Condensed" w:eastAsia="Barlow Semi Condensed" w:hAnsi="Barlow Semi Condensed"/>
           <w:sz w:val="24"/>
           <w:szCs w:val="24"/>
         </w:rPr>
@@ -3108,7 +3108,7 @@
       </w:r>
       <w:r>
         <w:rPr>
-          <w:rFonts w:ascii="Times New Roman" w:cs="Times New Roman" w:eastAsia="Times New Roman" w:hAnsi="Times New Roman"/>
+          <w:rFonts w:ascii="Barlow Semi Condensed" w:cs="Barlow Semi Condensed" w:eastAsia="Barlow Semi Condensed" w:hAnsi="Barlow Semi Condensed"/>
           <w:b/>
           <w:bCs/>
           <w:sz w:val="24"/>
@@ -3118,7 +3118,7 @@
       </w:r>
       <w:r>
         <w:rPr>
-          <w:rFonts w:ascii="Times New Roman" w:cs="Times New Roman" w:eastAsia="Times New Roman" w:hAnsi="Times New Roman"/>
+          <w:rFonts w:ascii="Barlow Semi Condensed" w:cs="Barlow Semi Condensed" w:eastAsia="Barlow Semi Condensed" w:hAnsi="Barlow Semi Condensed"/>
           <w:sz w:val="24"/>
           <w:szCs w:val="24"/>
         </w:rPr>
@@ -3126,7 +3126,7 @@
       </w:r>
       <w:r>
         <w:rPr>
-          <w:rFonts w:ascii="Times New Roman" w:cs="Times New Roman" w:eastAsia="Times New Roman" w:hAnsi="Times New Roman"/>
+          <w:rFonts w:ascii="Barlow Semi Condensed" w:cs="Barlow Semi Condensed" w:eastAsia="Barlow Semi Condensed" w:hAnsi="Barlow Semi Condensed"/>
           <w:b/>
           <w:bCs/>
           <w:sz w:val="24"/>
@@ -3136,7 +3136,7 @@
       </w:r>
       <w:r>
         <w:rPr>
-          <w:rFonts w:ascii="Times New Roman" w:cs="Times New Roman" w:eastAsia="Times New Roman" w:hAnsi="Times New Roman"/>
+          <w:rFonts w:ascii="Barlow Semi Condensed" w:cs="Barlow Semi Condensed" w:eastAsia="Barlow Semi Condensed" w:hAnsi="Barlow Semi Condensed"/>
           <w:sz w:val="24"/>
           <w:szCs w:val="24"/>
         </w:rPr>
@@ -3144,7 +3144,7 @@
       </w:r>
       <w:r>
         <w:rPr>
-          <w:rFonts w:ascii="Times New Roman" w:cs="Times New Roman" w:eastAsia="Times New Roman" w:hAnsi="Times New Roman"/>
+          <w:rFonts w:ascii="Barlow Semi Condensed" w:cs="Barlow Semi Condensed" w:eastAsia="Barlow Semi Condensed" w:hAnsi="Barlow Semi Condensed"/>
           <w:i/>
           <w:iCs/>
           <w:sz w:val="24"/>
@@ -3160,7 +3160,7 @@
       </w:pPr>
       <w:r>
         <w:rPr>
-          <w:rFonts w:ascii="Times New Roman" w:cs="Times New Roman" w:eastAsia="Times New Roman" w:hAnsi="Times New Roman"/>
+          <w:rFonts w:ascii="Barlow Semi Condensed" w:cs="Barlow Semi Condensed" w:eastAsia="Barlow Semi Condensed" w:hAnsi="Barlow Semi Condensed"/>
           <w:sz w:val="24"/>
           <w:szCs w:val="24"/>
         </w:rPr>
@@ -3174,7 +3174,7 @@
       </w:pPr>
       <w:r>
         <w:rPr>
-          <w:rFonts w:ascii="Times New Roman" w:cs="Times New Roman" w:eastAsia="Times New Roman" w:hAnsi="Times New Roman"/>
+          <w:rFonts w:ascii="Barlow Semi Condensed" w:cs="Barlow Semi Condensed" w:eastAsia="Barlow Semi Condensed" w:hAnsi="Barlow Semi Condensed"/>
           <w:b/>
           <w:bCs/>
           <w:sz w:val="24"/>
@@ -3184,7 +3184,7 @@
       </w:r>
       <w:r>
         <w:rPr>
-          <w:rFonts w:ascii="Times New Roman" w:cs="Times New Roman" w:eastAsia="Times New Roman" w:hAnsi="Times New Roman"/>
+          <w:rFonts w:ascii="Barlow Semi Condensed" w:cs="Barlow Semi Condensed" w:eastAsia="Barlow Semi Condensed" w:hAnsi="Barlow Semi Condensed"/>
           <w:sz w:val="24"/>
           <w:szCs w:val="24"/>
         </w:rPr>
@@ -3192,7 +3192,7 @@
       </w:r>
       <w:r>
         <w:rPr>
-          <w:rFonts w:ascii="Times New Roman" w:cs="Times New Roman" w:eastAsia="Times New Roman" w:hAnsi="Times New Roman"/>
+          <w:rFonts w:ascii="Barlow Semi Condensed" w:cs="Barlow Semi Condensed" w:eastAsia="Barlow Semi Condensed" w:hAnsi="Barlow Semi Condensed"/>
           <w:b/>
           <w:bCs/>
           <w:sz w:val="24"/>
@@ -3202,7 +3202,7 @@
       </w:r>
       <w:r>
         <w:rPr>
-          <w:rFonts w:ascii="Times New Roman" w:cs="Times New Roman" w:eastAsia="Times New Roman" w:hAnsi="Times New Roman"/>
+          <w:rFonts w:ascii="Barlow Semi Condensed" w:cs="Barlow Semi Condensed" w:eastAsia="Barlow Semi Condensed" w:hAnsi="Barlow Semi Condensed"/>
           <w:sz w:val="24"/>
           <w:szCs w:val="24"/>
         </w:rPr>
@@ -3210,7 +3210,7 @@
       </w:r>
       <w:r>
         <w:rPr>
-          <w:rFonts w:ascii="Times New Roman" w:cs="Times New Roman" w:eastAsia="Times New Roman" w:hAnsi="Times New Roman"/>
+          <w:rFonts w:ascii="Barlow Semi Condensed" w:cs="Barlow Semi Condensed" w:eastAsia="Barlow Semi Condensed" w:hAnsi="Barlow Semi Condensed"/>
           <w:b/>
           <w:bCs/>
           <w:sz w:val="24"/>
@@ -3220,7 +3220,7 @@
       </w:r>
       <w:r>
         <w:rPr>
-          <w:rFonts w:ascii="Times New Roman" w:cs="Times New Roman" w:eastAsia="Times New Roman" w:hAnsi="Times New Roman"/>
+          <w:rFonts w:ascii="Barlow Semi Condensed" w:cs="Barlow Semi Condensed" w:eastAsia="Barlow Semi Condensed" w:hAnsi="Barlow Semi Condensed"/>
           <w:sz w:val="24"/>
           <w:szCs w:val="24"/>
         </w:rPr>
@@ -3228,7 +3228,7 @@
       </w:r>
       <w:r>
         <w:rPr>
-          <w:rFonts w:ascii="Times New Roman" w:cs="Times New Roman" w:eastAsia="Times New Roman" w:hAnsi="Times New Roman"/>
+          <w:rFonts w:ascii="Barlow Semi Condensed" w:cs="Barlow Semi Condensed" w:eastAsia="Barlow Semi Condensed" w:hAnsi="Barlow Semi Condensed"/>
           <w:b/>
           <w:bCs/>
           <w:sz w:val="24"/>
@@ -3238,7 +3238,7 @@
       </w:r>
       <w:r>
         <w:rPr>
-          <w:rFonts w:ascii="Times New Roman" w:cs="Times New Roman" w:eastAsia="Times New Roman" w:hAnsi="Times New Roman"/>
+          <w:rFonts w:ascii="Barlow Semi Condensed" w:cs="Barlow Semi Condensed" w:eastAsia="Barlow Semi Condensed" w:hAnsi="Barlow Semi Condensed"/>
           <w:sz w:val="24"/>
           <w:szCs w:val="24"/>
         </w:rPr>
@@ -3246,7 +3246,7 @@
       </w:r>
       <w:r>
         <w:rPr>
-          <w:rFonts w:ascii="Times New Roman" w:cs="Times New Roman" w:eastAsia="Times New Roman" w:hAnsi="Times New Roman"/>
+          <w:rFonts w:ascii="Barlow Semi Condensed" w:cs="Barlow Semi Condensed" w:eastAsia="Barlow Semi Condensed" w:hAnsi="Barlow Semi Condensed"/>
           <w:b/>
           <w:bCs/>
           <w:sz w:val="24"/>
@@ -3256,7 +3256,7 @@
       </w:r>
       <w:r>
         <w:rPr>
-          <w:rFonts w:ascii="Times New Roman" w:cs="Times New Roman" w:eastAsia="Times New Roman" w:hAnsi="Times New Roman"/>
+          <w:rFonts w:ascii="Barlow Semi Condensed" w:cs="Barlow Semi Condensed" w:eastAsia="Barlow Semi Condensed" w:hAnsi="Barlow Semi Condensed"/>
           <w:sz w:val="24"/>
           <w:szCs w:val="24"/>
         </w:rPr>
@@ -3264,7 +3264,7 @@
       </w:r>
       <w:r>
         <w:rPr>
-          <w:rFonts w:ascii="Times New Roman" w:cs="Times New Roman" w:eastAsia="Times New Roman" w:hAnsi="Times New Roman"/>
+          <w:rFonts w:ascii="Barlow Semi Condensed" w:cs="Barlow Semi Condensed" w:eastAsia="Barlow Semi Condensed" w:hAnsi="Barlow Semi Condensed"/>
           <w:b/>
           <w:bCs/>
           <w:sz w:val="24"/>
@@ -3274,7 +3274,7 @@
       </w:r>
       <w:r>
         <w:rPr>
-          <w:rFonts w:ascii="Times New Roman" w:cs="Times New Roman" w:eastAsia="Times New Roman" w:hAnsi="Times New Roman"/>
+          <w:rFonts w:ascii="Barlow Semi Condensed" w:cs="Barlow Semi Condensed" w:eastAsia="Barlow Semi Condensed" w:hAnsi="Barlow Semi Condensed"/>
           <w:sz w:val="24"/>
           <w:szCs w:val="24"/>
         </w:rPr>
@@ -3282,7 +3282,7 @@
       </w:r>
       <w:r>
         <w:rPr>
-          <w:rFonts w:ascii="Times New Roman" w:cs="Times New Roman" w:eastAsia="Times New Roman" w:hAnsi="Times New Roman"/>
+          <w:rFonts w:ascii="Barlow Semi Condensed" w:cs="Barlow Semi Condensed" w:eastAsia="Barlow Semi Condensed" w:hAnsi="Barlow Semi Condensed"/>
           <w:b/>
           <w:bCs/>
           <w:sz w:val="24"/>
@@ -3292,7 +3292,7 @@
       </w:r>
       <w:r>
         <w:rPr>
-          <w:rFonts w:ascii="Times New Roman" w:cs="Times New Roman" w:eastAsia="Times New Roman" w:hAnsi="Times New Roman"/>
+          <w:rFonts w:ascii="Barlow Semi Condensed" w:cs="Barlow Semi Condensed" w:eastAsia="Barlow Semi Condensed" w:hAnsi="Barlow Semi Condensed"/>
           <w:sz w:val="24"/>
           <w:szCs w:val="24"/>
         </w:rPr>
@@ -3300,7 +3300,7 @@
       </w:r>
       <w:r>
         <w:rPr>
-          <w:rFonts w:ascii="Times New Roman" w:cs="Times New Roman" w:eastAsia="Times New Roman" w:hAnsi="Times New Roman"/>
+          <w:rFonts w:ascii="Barlow Semi Condensed" w:cs="Barlow Semi Condensed" w:eastAsia="Barlow Semi Condensed" w:hAnsi="Barlow Semi Condensed"/>
           <w:b/>
           <w:bCs/>
           <w:sz w:val="24"/>
@@ -3310,7 +3310,7 @@
       </w:r>
       <w:r>
         <w:rPr>
-          <w:rFonts w:ascii="Times New Roman" w:cs="Times New Roman" w:eastAsia="Times New Roman" w:hAnsi="Times New Roman"/>
+          <w:rFonts w:ascii="Barlow Semi Condensed" w:cs="Barlow Semi Condensed" w:eastAsia="Barlow Semi Condensed" w:hAnsi="Barlow Semi Condensed"/>
           <w:sz w:val="24"/>
           <w:szCs w:val="24"/>
         </w:rPr>
@@ -3318,7 +3318,7 @@
       </w:r>
       <w:r>
         <w:rPr>
-          <w:rFonts w:ascii="Times New Roman" w:cs="Times New Roman" w:eastAsia="Times New Roman" w:hAnsi="Times New Roman"/>
+          <w:rFonts w:ascii="Barlow Semi Condensed" w:cs="Barlow Semi Condensed" w:eastAsia="Barlow Semi Condensed" w:hAnsi="Barlow Semi Condensed"/>
           <w:b/>
           <w:bCs/>
           <w:sz w:val="24"/>
@@ -3328,7 +3328,7 @@
       </w:r>
       <w:r>
         <w:rPr>
-          <w:rFonts w:ascii="Times New Roman" w:cs="Times New Roman" w:eastAsia="Times New Roman" w:hAnsi="Times New Roman"/>
+          <w:rFonts w:ascii="Barlow Semi Condensed" w:cs="Barlow Semi Condensed" w:eastAsia="Barlow Semi Condensed" w:hAnsi="Barlow Semi Condensed"/>
           <w:sz w:val="24"/>
           <w:szCs w:val="24"/>
         </w:rPr>
@@ -3336,7 +3336,7 @@
       </w:r>
       <w:r>
         <w:rPr>
-          <w:rFonts w:ascii="Times New Roman" w:cs="Times New Roman" w:eastAsia="Times New Roman" w:hAnsi="Times New Roman"/>
+          <w:rFonts w:ascii="Barlow Semi Condensed" w:cs="Barlow Semi Condensed" w:eastAsia="Barlow Semi Condensed" w:hAnsi="Barlow Semi Condensed"/>
           <w:b/>
           <w:bCs/>
           <w:sz w:val="24"/>
@@ -3346,7 +3346,7 @@
       </w:r>
       <w:r>
         <w:rPr>
-          <w:rFonts w:ascii="Times New Roman" w:cs="Times New Roman" w:eastAsia="Times New Roman" w:hAnsi="Times New Roman"/>
+          <w:rFonts w:ascii="Barlow Semi Condensed" w:cs="Barlow Semi Condensed" w:eastAsia="Barlow Semi Condensed" w:hAnsi="Barlow Semi Condensed"/>
           <w:sz w:val="24"/>
           <w:szCs w:val="24"/>
         </w:rPr>
@@ -3354,7 +3354,7 @@
       </w:r>
       <w:r>
         <w:rPr>
-          <w:rFonts w:ascii="Times New Roman" w:cs="Times New Roman" w:eastAsia="Times New Roman" w:hAnsi="Times New Roman"/>
+          <w:rFonts w:ascii="Barlow Semi Condensed" w:cs="Barlow Semi Condensed" w:eastAsia="Barlow Semi Condensed" w:hAnsi="Barlow Semi Condensed"/>
           <w:b/>
           <w:bCs/>
           <w:sz w:val="24"/>
@@ -3364,7 +3364,7 @@
       </w:r>
       <w:r>
         <w:rPr>
-          <w:rFonts w:ascii="Times New Roman" w:cs="Times New Roman" w:eastAsia="Times New Roman" w:hAnsi="Times New Roman"/>
+          <w:rFonts w:ascii="Barlow Semi Condensed" w:cs="Barlow Semi Condensed" w:eastAsia="Barlow Semi Condensed" w:hAnsi="Barlow Semi Condensed"/>
           <w:sz w:val="24"/>
           <w:szCs w:val="24"/>
         </w:rPr>
@@ -3372,7 +3372,7 @@
       </w:r>
       <w:r>
         <w:rPr>
-          <w:rFonts w:ascii="Times New Roman" w:cs="Times New Roman" w:eastAsia="Times New Roman" w:hAnsi="Times New Roman"/>
+          <w:rFonts w:ascii="Barlow Semi Condensed" w:cs="Barlow Semi Condensed" w:eastAsia="Barlow Semi Condensed" w:hAnsi="Barlow Semi Condensed"/>
           <w:b/>
           <w:bCs/>
           <w:sz w:val="24"/>
@@ -3382,7 +3382,7 @@
       </w:r>
       <w:r>
         <w:rPr>
-          <w:rFonts w:ascii="Times New Roman" w:cs="Times New Roman" w:eastAsia="Times New Roman" w:hAnsi="Times New Roman"/>
+          <w:rFonts w:ascii="Barlow Semi Condensed" w:cs="Barlow Semi Condensed" w:eastAsia="Barlow Semi Condensed" w:hAnsi="Barlow Semi Condensed"/>
           <w:sz w:val="24"/>
           <w:szCs w:val="24"/>
         </w:rPr>
@@ -3396,7 +3396,7 @@
       </w:pPr>
       <w:r>
         <w:rPr>
-          <w:rFonts w:ascii="Times New Roman" w:cs="Times New Roman" w:eastAsia="Times New Roman" w:hAnsi="Times New Roman"/>
+          <w:rFonts w:ascii="Barlow Semi Condensed" w:cs="Barlow Semi Condensed" w:eastAsia="Barlow Semi Condensed" w:hAnsi="Barlow Semi Condensed"/>
           <w:sz w:val="24"/>
           <w:szCs w:val="24"/>
         </w:rPr>
@@ -3410,7 +3410,7 @@
       </w:pPr>
       <w:r>
         <w:rPr>
-          <w:rFonts w:ascii="Times New Roman" w:cs="Times New Roman" w:eastAsia="Times New Roman" w:hAnsi="Times New Roman"/>
+          <w:rFonts w:ascii="Barlow Semi Condensed" w:cs="Barlow Semi Condensed" w:eastAsia="Barlow Semi Condensed" w:hAnsi="Barlow Semi Condensed"/>
           <w:b/>
           <w:bCs/>
           <w:sz w:val="24"/>
@@ -3420,7 +3420,7 @@
       </w:r>
       <w:r>
         <w:rPr>
-          <w:rFonts w:ascii="Times New Roman" w:cs="Times New Roman" w:eastAsia="Times New Roman" w:hAnsi="Times New Roman"/>
+          <w:rFonts w:ascii="Barlow Semi Condensed" w:cs="Barlow Semi Condensed" w:eastAsia="Barlow Semi Condensed" w:hAnsi="Barlow Semi Condensed"/>
           <w:sz w:val="24"/>
           <w:szCs w:val="24"/>
         </w:rPr>
@@ -3428,7 +3428,7 @@
       </w:r>
       <w:r>
         <w:rPr>
-          <w:rFonts w:ascii="Times New Roman" w:cs="Times New Roman" w:eastAsia="Times New Roman" w:hAnsi="Times New Roman"/>
+          <w:rFonts w:ascii="Barlow Semi Condensed" w:cs="Barlow Semi Condensed" w:eastAsia="Barlow Semi Condensed" w:hAnsi="Barlow Semi Condensed"/>
           <w:i/>
           <w:iCs/>
           <w:sz w:val="24"/>
@@ -3438,7 +3438,7 @@
       </w:r>
       <w:r>
         <w:rPr>
-          <w:rFonts w:ascii="Times New Roman" w:cs="Times New Roman" w:eastAsia="Times New Roman" w:hAnsi="Times New Roman"/>
+          <w:rFonts w:ascii="Barlow Semi Condensed" w:cs="Barlow Semi Condensed" w:eastAsia="Barlow Semi Condensed" w:hAnsi="Barlow Semi Condensed"/>
           <w:sz w:val="24"/>
           <w:szCs w:val="24"/>
         </w:rPr>
@@ -3446,7 +3446,7 @@
       </w:r>
       <w:r>
         <w:rPr>
-          <w:rFonts w:ascii="Times New Roman" w:cs="Times New Roman" w:eastAsia="Times New Roman" w:hAnsi="Times New Roman"/>
+          <w:rFonts w:ascii="Barlow Semi Condensed" w:cs="Barlow Semi Condensed" w:eastAsia="Barlow Semi Condensed" w:hAnsi="Barlow Semi Condensed"/>
           <w:b/>
           <w:bCs/>
           <w:sz w:val="24"/>
@@ -3456,7 +3456,7 @@
       </w:r>
       <w:r>
         <w:rPr>
-          <w:rFonts w:ascii="Times New Roman" w:cs="Times New Roman" w:eastAsia="Times New Roman" w:hAnsi="Times New Roman"/>
+          <w:rFonts w:ascii="Barlow Semi Condensed" w:cs="Barlow Semi Condensed" w:eastAsia="Barlow Semi Condensed" w:hAnsi="Barlow Semi Condensed"/>
           <w:sz w:val="24"/>
           <w:szCs w:val="24"/>
         </w:rPr>
@@ -3464,7 +3464,7 @@
       </w:r>
       <w:r>
         <w:rPr>
-          <w:rFonts w:ascii="Times New Roman" w:cs="Times New Roman" w:eastAsia="Times New Roman" w:hAnsi="Times New Roman"/>
+          <w:rFonts w:ascii="Barlow Semi Condensed" w:cs="Barlow Semi Condensed" w:eastAsia="Barlow Semi Condensed" w:hAnsi="Barlow Semi Condensed"/>
           <w:i/>
           <w:iCs/>
           <w:sz w:val="24"/>
@@ -3474,7 +3474,7 @@
       </w:r>
       <w:r>
         <w:rPr>
-          <w:rFonts w:ascii="Times New Roman" w:cs="Times New Roman" w:eastAsia="Times New Roman" w:hAnsi="Times New Roman"/>
+          <w:rFonts w:ascii="Barlow Semi Condensed" w:cs="Barlow Semi Condensed" w:eastAsia="Barlow Semi Condensed" w:hAnsi="Barlow Semi Condensed"/>
           <w:sz w:val="24"/>
           <w:szCs w:val="24"/>
         </w:rPr>
@@ -3482,7 +3482,7 @@
       </w:r>
       <w:r>
         <w:rPr>
-          <w:rFonts w:ascii="Times New Roman" w:cs="Times New Roman" w:eastAsia="Times New Roman" w:hAnsi="Times New Roman"/>
+          <w:rFonts w:ascii="Barlow Semi Condensed" w:cs="Barlow Semi Condensed" w:eastAsia="Barlow Semi Condensed" w:hAnsi="Barlow Semi Condensed"/>
           <w:i/>
           <w:iCs/>
           <w:sz w:val="24"/>
@@ -3492,7 +3492,7 @@
       </w:r>
       <w:r>
         <w:rPr>
-          <w:rFonts w:ascii="Times New Roman" w:cs="Times New Roman" w:eastAsia="Times New Roman" w:hAnsi="Times New Roman"/>
+          <w:rFonts w:ascii="Barlow Semi Condensed" w:cs="Barlow Semi Condensed" w:eastAsia="Barlow Semi Condensed" w:hAnsi="Barlow Semi Condensed"/>
           <w:sz w:val="24"/>
           <w:szCs w:val="24"/>
         </w:rPr>
@@ -3500,7 +3500,7 @@
       </w:r>
       <w:r>
         <w:rPr>
-          <w:rFonts w:ascii="Times New Roman" w:cs="Times New Roman" w:eastAsia="Times New Roman" w:hAnsi="Times New Roman"/>
+          <w:rFonts w:ascii="Barlow Semi Condensed" w:cs="Barlow Semi Condensed" w:eastAsia="Barlow Semi Condensed" w:hAnsi="Barlow Semi Condensed"/>
           <w:b/>
           <w:bCs/>
           <w:sz w:val="24"/>
@@ -3510,7 +3510,7 @@
       </w:r>
       <w:r>
         <w:rPr>
-          <w:rFonts w:ascii="Times New Roman" w:cs="Times New Roman" w:eastAsia="Times New Roman" w:hAnsi="Times New Roman"/>
+          <w:rFonts w:ascii="Barlow Semi Condensed" w:cs="Barlow Semi Condensed" w:eastAsia="Barlow Semi Condensed" w:hAnsi="Barlow Semi Condensed"/>
           <w:sz w:val="24"/>
           <w:szCs w:val="24"/>
         </w:rPr>
@@ -3518,7 +3518,7 @@
       </w:r>
       <w:r>
         <w:rPr>
-          <w:rFonts w:ascii="Times New Roman" w:cs="Times New Roman" w:eastAsia="Times New Roman" w:hAnsi="Times New Roman"/>
+          <w:rFonts w:ascii="Barlow Semi Condensed" w:cs="Barlow Semi Condensed" w:eastAsia="Barlow Semi Condensed" w:hAnsi="Barlow Semi Condensed"/>
           <w:b/>
           <w:bCs/>
           <w:sz w:val="24"/>
@@ -3528,7 +3528,7 @@
       </w:r>
       <w:r>
         <w:rPr>
-          <w:rFonts w:ascii="Times New Roman" w:cs="Times New Roman" w:eastAsia="Times New Roman" w:hAnsi="Times New Roman"/>
+          <w:rFonts w:ascii="Barlow Semi Condensed" w:cs="Barlow Semi Condensed" w:eastAsia="Barlow Semi Condensed" w:hAnsi="Barlow Semi Condensed"/>
           <w:sz w:val="24"/>
           <w:szCs w:val="24"/>
         </w:rPr>
@@ -3536,7 +3536,7 @@
       </w:r>
       <w:r>
         <w:rPr>
-          <w:rFonts w:ascii="Times New Roman" w:cs="Times New Roman" w:eastAsia="Times New Roman" w:hAnsi="Times New Roman"/>
+          <w:rFonts w:ascii="Barlow Semi Condensed" w:cs="Barlow Semi Condensed" w:eastAsia="Barlow Semi Condensed" w:hAnsi="Barlow Semi Condensed"/>
           <w:i/>
           <w:iCs/>
           <w:sz w:val="24"/>
@@ -3546,7 +3546,7 @@
       </w:r>
       <w:r>
         <w:rPr>
-          <w:rFonts w:ascii="Times New Roman" w:cs="Times New Roman" w:eastAsia="Times New Roman" w:hAnsi="Times New Roman"/>
+          <w:rFonts w:ascii="Barlow Semi Condensed" w:cs="Barlow Semi Condensed" w:eastAsia="Barlow Semi Condensed" w:hAnsi="Barlow Semi Condensed"/>
           <w:sz w:val="24"/>
           <w:szCs w:val="24"/>
         </w:rPr>
@@ -3554,7 +3554,7 @@
       </w:r>
       <w:r>
         <w:rPr>
-          <w:rFonts w:ascii="Times New Roman" w:cs="Times New Roman" w:eastAsia="Times New Roman" w:hAnsi="Times New Roman"/>
+          <w:rFonts w:ascii="Barlow Semi Condensed" w:cs="Barlow Semi Condensed" w:eastAsia="Barlow Semi Condensed" w:hAnsi="Barlow Semi Condensed"/>
           <w:b/>
           <w:bCs/>
           <w:sz w:val="24"/>
@@ -3564,7 +3564,7 @@
       </w:r>
       <w:r>
         <w:rPr>
-          <w:rFonts w:ascii="Times New Roman" w:cs="Times New Roman" w:eastAsia="Times New Roman" w:hAnsi="Times New Roman"/>
+          <w:rFonts w:ascii="Barlow Semi Condensed" w:cs="Barlow Semi Condensed" w:eastAsia="Barlow Semi Condensed" w:hAnsi="Barlow Semi Condensed"/>
           <w:sz w:val="24"/>
           <w:szCs w:val="24"/>
         </w:rPr>
@@ -3572,7 +3572,7 @@
       </w:r>
       <w:r>
         <w:rPr>
-          <w:rFonts w:ascii="Times New Roman" w:cs="Times New Roman" w:eastAsia="Times New Roman" w:hAnsi="Times New Roman"/>
+          <w:rFonts w:ascii="Barlow Semi Condensed" w:cs="Barlow Semi Condensed" w:eastAsia="Barlow Semi Condensed" w:hAnsi="Barlow Semi Condensed"/>
           <w:b/>
           <w:bCs/>
           <w:sz w:val="24"/>
@@ -3582,7 +3582,7 @@
       </w:r>
       <w:r>
         <w:rPr>
-          <w:rFonts w:ascii="Times New Roman" w:cs="Times New Roman" w:eastAsia="Times New Roman" w:hAnsi="Times New Roman"/>
+          <w:rFonts w:ascii="Barlow Semi Condensed" w:cs="Barlow Semi Condensed" w:eastAsia="Barlow Semi Condensed" w:hAnsi="Barlow Semi Condensed"/>
           <w:sz w:val="24"/>
           <w:szCs w:val="24"/>
         </w:rPr>
@@ -3590,7 +3590,7 @@
       </w:r>
       <w:r>
         <w:rPr>
-          <w:rFonts w:ascii="Times New Roman" w:cs="Times New Roman" w:eastAsia="Times New Roman" w:hAnsi="Times New Roman"/>
+          <w:rFonts w:ascii="Barlow Semi Condensed" w:cs="Barlow Semi Condensed" w:eastAsia="Barlow Semi Condensed" w:hAnsi="Barlow Semi Condensed"/>
           <w:i/>
           <w:iCs/>
           <w:sz w:val="24"/>
@@ -3600,7 +3600,7 @@
       </w:r>
       <w:r>
         <w:rPr>
-          <w:rFonts w:ascii="Times New Roman" w:cs="Times New Roman" w:eastAsia="Times New Roman" w:hAnsi="Times New Roman"/>
+          <w:rFonts w:ascii="Barlow Semi Condensed" w:cs="Barlow Semi Condensed" w:eastAsia="Barlow Semi Condensed" w:hAnsi="Barlow Semi Condensed"/>
           <w:sz w:val="24"/>
           <w:szCs w:val="24"/>
         </w:rPr>
@@ -3608,7 +3608,7 @@
       </w:r>
       <w:r>
         <w:rPr>
-          <w:rFonts w:ascii="Times New Roman" w:cs="Times New Roman" w:eastAsia="Times New Roman" w:hAnsi="Times New Roman"/>
+          <w:rFonts w:ascii="Barlow Semi Condensed" w:cs="Barlow Semi Condensed" w:eastAsia="Barlow Semi Condensed" w:hAnsi="Barlow Semi Condensed"/>
           <w:b/>
           <w:bCs/>
           <w:sz w:val="24"/>
@@ -3618,7 +3618,7 @@
       </w:r>
       <w:r>
         <w:rPr>
-          <w:rFonts w:ascii="Times New Roman" w:cs="Times New Roman" w:eastAsia="Times New Roman" w:hAnsi="Times New Roman"/>
+          <w:rFonts w:ascii="Barlow Semi Condensed" w:cs="Barlow Semi Condensed" w:eastAsia="Barlow Semi Condensed" w:hAnsi="Barlow Semi Condensed"/>
           <w:sz w:val="24"/>
           <w:szCs w:val="24"/>
         </w:rPr>
@@ -3626,7 +3626,7 @@
       </w:r>
       <w:r>
         <w:rPr>
-          <w:rFonts w:ascii="Times New Roman" w:cs="Times New Roman" w:eastAsia="Times New Roman" w:hAnsi="Times New Roman"/>
+          <w:rFonts w:ascii="Barlow Semi Condensed" w:cs="Barlow Semi Condensed" w:eastAsia="Barlow Semi Condensed" w:hAnsi="Barlow Semi Condensed"/>
           <w:i/>
           <w:iCs/>
           <w:sz w:val="24"/>
@@ -3636,7 +3636,7 @@
       </w:r>
       <w:r>
         <w:rPr>
-          <w:rFonts w:ascii="Times New Roman" w:cs="Times New Roman" w:eastAsia="Times New Roman" w:hAnsi="Times New Roman"/>
+          <w:rFonts w:ascii="Barlow Semi Condensed" w:cs="Barlow Semi Condensed" w:eastAsia="Barlow Semi Condensed" w:hAnsi="Barlow Semi Condensed"/>
           <w:sz w:val="24"/>
           <w:szCs w:val="24"/>
         </w:rPr>
@@ -3644,7 +3644,7 @@
       </w:r>
       <w:r>
         <w:rPr>
-          <w:rFonts w:ascii="Times New Roman" w:cs="Times New Roman" w:eastAsia="Times New Roman" w:hAnsi="Times New Roman"/>
+          <w:rFonts w:ascii="Barlow Semi Condensed" w:cs="Barlow Semi Condensed" w:eastAsia="Barlow Semi Condensed" w:hAnsi="Barlow Semi Condensed"/>
           <w:b/>
           <w:bCs/>
           <w:sz w:val="24"/>
@@ -3654,7 +3654,7 @@
       </w:r>
       <w:r>
         <w:rPr>
-          <w:rFonts w:ascii="Times New Roman" w:cs="Times New Roman" w:eastAsia="Times New Roman" w:hAnsi="Times New Roman"/>
+          <w:rFonts w:ascii="Barlow Semi Condensed" w:cs="Barlow Semi Condensed" w:eastAsia="Barlow Semi Condensed" w:hAnsi="Barlow Semi Condensed"/>
           <w:sz w:val="24"/>
           <w:szCs w:val="24"/>
         </w:rPr>
@@ -3662,7 +3662,7 @@
       </w:r>
       <w:r>
         <w:rPr>
-          <w:rFonts w:ascii="Times New Roman" w:cs="Times New Roman" w:eastAsia="Times New Roman" w:hAnsi="Times New Roman"/>
+          <w:rFonts w:ascii="Barlow Semi Condensed" w:cs="Barlow Semi Condensed" w:eastAsia="Barlow Semi Condensed" w:hAnsi="Barlow Semi Condensed"/>
           <w:i/>
           <w:iCs/>
           <w:sz w:val="24"/>
@@ -3672,7 +3672,7 @@
       </w:r>
       <w:r>
         <w:rPr>
-          <w:rFonts w:ascii="Times New Roman" w:cs="Times New Roman" w:eastAsia="Times New Roman" w:hAnsi="Times New Roman"/>
+          <w:rFonts w:ascii="Barlow Semi Condensed" w:cs="Barlow Semi Condensed" w:eastAsia="Barlow Semi Condensed" w:hAnsi="Barlow Semi Condensed"/>
           <w:sz w:val="24"/>
           <w:szCs w:val="24"/>
         </w:rPr>
@@ -3694,7 +3694,7 @@
       </w:pPr>
       <w:r>
         <w:rPr>
-          <w:rFonts w:ascii="Times New Roman" w:cs="Times New Roman" w:eastAsia="Times New Roman" w:hAnsi="Times New Roman"/>
+          <w:rFonts w:ascii="Barlow Semi Condensed" w:cs="Barlow Semi Condensed" w:eastAsia="Barlow Semi Condensed" w:hAnsi="Barlow Semi Condensed"/>
           <w:sz w:val="24"/>
           <w:szCs w:val="24"/>
         </w:rPr>
@@ -3708,7 +3708,7 @@
       </w:pPr>
       <w:r>
         <w:rPr>
-          <w:rFonts w:ascii="Times New Roman" w:cs="Times New Roman" w:eastAsia="Times New Roman" w:hAnsi="Times New Roman"/>
+          <w:rFonts w:ascii="Barlow Semi Condensed" w:cs="Barlow Semi Condensed" w:eastAsia="Barlow Semi Condensed" w:hAnsi="Barlow Semi Condensed"/>
           <w:b/>
           <w:bCs/>
           <w:sz w:val="24"/>
@@ -3718,7 +3718,7 @@
       </w:r>
       <w:r>
         <w:rPr>
-          <w:rFonts w:ascii="Times New Roman" w:cs="Times New Roman" w:eastAsia="Times New Roman" w:hAnsi="Times New Roman"/>
+          <w:rFonts w:ascii="Barlow Semi Condensed" w:cs="Barlow Semi Condensed" w:eastAsia="Barlow Semi Condensed" w:hAnsi="Barlow Semi Condensed"/>
           <w:sz w:val="24"/>
           <w:szCs w:val="24"/>
         </w:rPr>
@@ -3732,7 +3732,7 @@
       </w:pPr>
       <w:r>
         <w:rPr>
-          <w:rFonts w:ascii="Times New Roman" w:cs="Times New Roman" w:eastAsia="Times New Roman" w:hAnsi="Times New Roman"/>
+          <w:rFonts w:ascii="Barlow Semi Condensed" w:cs="Barlow Semi Condensed" w:eastAsia="Barlow Semi Condensed" w:hAnsi="Barlow Semi Condensed"/>
           <w:b/>
           <w:bCs/>
           <w:sz w:val="24"/>
@@ -3742,7 +3742,7 @@
       </w:r>
       <w:r>
         <w:rPr>
-          <w:rFonts w:ascii="Times New Roman" w:cs="Times New Roman" w:eastAsia="Times New Roman" w:hAnsi="Times New Roman"/>
+          <w:rFonts w:ascii="Barlow Semi Condensed" w:cs="Barlow Semi Condensed" w:eastAsia="Barlow Semi Condensed" w:hAnsi="Barlow Semi Condensed"/>
           <w:sz w:val="24"/>
           <w:szCs w:val="24"/>
         </w:rPr>
@@ -3756,7 +3756,7 @@
       </w:pPr>
       <w:r>
         <w:rPr>
-          <w:rFonts w:ascii="Times New Roman" w:cs="Times New Roman" w:eastAsia="Times New Roman" w:hAnsi="Times New Roman"/>
+          <w:rFonts w:ascii="Barlow Semi Condensed" w:cs="Barlow Semi Condensed" w:eastAsia="Barlow Semi Condensed" w:hAnsi="Barlow Semi Condensed"/>
           <w:b/>
           <w:bCs/>
           <w:sz w:val="24"/>
@@ -3766,7 +3766,7 @@
       </w:r>
       <w:r>
         <w:rPr>
-          <w:rFonts w:ascii="Times New Roman" w:cs="Times New Roman" w:eastAsia="Times New Roman" w:hAnsi="Times New Roman"/>
+          <w:rFonts w:ascii="Barlow Semi Condensed" w:cs="Barlow Semi Condensed" w:eastAsia="Barlow Semi Condensed" w:hAnsi="Barlow Semi Condensed"/>
           <w:sz w:val="24"/>
           <w:szCs w:val="24"/>
         </w:rPr>
@@ -3774,7 +3774,7 @@
       </w:r>
       <w:r>
         <w:rPr>
-          <w:rFonts w:ascii="Times New Roman" w:cs="Times New Roman" w:eastAsia="Times New Roman" w:hAnsi="Times New Roman"/>
+          <w:rFonts w:ascii="Barlow Semi Condensed" w:cs="Barlow Semi Condensed" w:eastAsia="Barlow Semi Condensed" w:hAnsi="Barlow Semi Condensed"/>
           <w:i/>
           <w:iCs/>
           <w:sz w:val="24"/>
@@ -3784,7 +3784,7 @@
       </w:r>
       <w:r>
         <w:rPr>
-          <w:rFonts w:ascii="Times New Roman" w:cs="Times New Roman" w:eastAsia="Times New Roman" w:hAnsi="Times New Roman"/>
+          <w:rFonts w:ascii="Barlow Semi Condensed" w:cs="Barlow Semi Condensed" w:eastAsia="Barlow Semi Condensed" w:hAnsi="Barlow Semi Condensed"/>
           <w:sz w:val="24"/>
           <w:szCs w:val="24"/>
         </w:rPr>
@@ -3798,7 +3798,7 @@
       </w:pPr>
       <w:r>
         <w:rPr>
-          <w:rFonts w:ascii="Times New Roman" w:cs="Times New Roman" w:eastAsia="Times New Roman" w:hAnsi="Times New Roman"/>
+          <w:rFonts w:ascii="Barlow Semi Condensed" w:cs="Barlow Semi Condensed" w:eastAsia="Barlow Semi Condensed" w:hAnsi="Barlow Semi Condensed"/>
           <w:b/>
           <w:bCs/>
           <w:sz w:val="24"/>
@@ -3808,7 +3808,7 @@
       </w:r>
       <w:r>
         <w:rPr>
-          <w:rFonts w:ascii="Times New Roman" w:cs="Times New Roman" w:eastAsia="Times New Roman" w:hAnsi="Times New Roman"/>
+          <w:rFonts w:ascii="Barlow Semi Condensed" w:cs="Barlow Semi Condensed" w:eastAsia="Barlow Semi Condensed" w:hAnsi="Barlow Semi Condensed"/>
           <w:sz w:val="24"/>
           <w:szCs w:val="24"/>
         </w:rPr>
@@ -3816,7 +3816,7 @@
       </w:r>
       <w:r>
         <w:rPr>
-          <w:rFonts w:ascii="Times New Roman" w:cs="Times New Roman" w:eastAsia="Times New Roman" w:hAnsi="Times New Roman"/>
+          <w:rFonts w:ascii="Barlow Semi Condensed" w:cs="Barlow Semi Condensed" w:eastAsia="Barlow Semi Condensed" w:hAnsi="Barlow Semi Condensed"/>
           <w:i/>
           <w:iCs/>
           <w:sz w:val="24"/>
@@ -3826,7 +3826,7 @@
       </w:r>
       <w:r>
         <w:rPr>
-          <w:rFonts w:ascii="Times New Roman" w:cs="Times New Roman" w:eastAsia="Times New Roman" w:hAnsi="Times New Roman"/>
+          <w:rFonts w:ascii="Barlow Semi Condensed" w:cs="Barlow Semi Condensed" w:eastAsia="Barlow Semi Condensed" w:hAnsi="Barlow Semi Condensed"/>
           <w:sz w:val="24"/>
           <w:szCs w:val="24"/>
         </w:rPr>
@@ -3840,7 +3840,7 @@
       </w:pPr>
       <w:r>
         <w:rPr>
-          <w:rFonts w:ascii="Times New Roman" w:cs="Times New Roman" w:eastAsia="Times New Roman" w:hAnsi="Times New Roman"/>
+          <w:rFonts w:ascii="Barlow Semi Condensed" w:cs="Barlow Semi Condensed" w:eastAsia="Barlow Semi Condensed" w:hAnsi="Barlow Semi Condensed"/>
           <w:b/>
           <w:bCs/>
           <w:sz w:val="24"/>
@@ -3850,7 +3850,7 @@
       </w:r>
       <w:r>
         <w:rPr>
-          <w:rFonts w:ascii="Times New Roman" w:cs="Times New Roman" w:eastAsia="Times New Roman" w:hAnsi="Times New Roman"/>
+          <w:rFonts w:ascii="Barlow Semi Condensed" w:cs="Barlow Semi Condensed" w:eastAsia="Barlow Semi Condensed" w:hAnsi="Barlow Semi Condensed"/>
           <w:sz w:val="24"/>
           <w:szCs w:val="24"/>
         </w:rPr>
@@ -3858,7 +3858,7 @@
       </w:r>
       <w:r>
         <w:rPr>
-          <w:rFonts w:ascii="Times New Roman" w:cs="Times New Roman" w:eastAsia="Times New Roman" w:hAnsi="Times New Roman"/>
+          <w:rFonts w:ascii="Barlow Semi Condensed" w:cs="Barlow Semi Condensed" w:eastAsia="Barlow Semi Condensed" w:hAnsi="Barlow Semi Condensed"/>
           <w:i/>
           <w:iCs/>
           <w:sz w:val="24"/>
@@ -3868,7 +3868,7 @@
       </w:r>
       <w:r>
         <w:rPr>
-          <w:rFonts w:ascii="Times New Roman" w:cs="Times New Roman" w:eastAsia="Times New Roman" w:hAnsi="Times New Roman"/>
+          <w:rFonts w:ascii="Barlow Semi Condensed" w:cs="Barlow Semi Condensed" w:eastAsia="Barlow Semi Condensed" w:hAnsi="Barlow Semi Condensed"/>
           <w:sz w:val="24"/>
           <w:szCs w:val="24"/>
         </w:rPr>
@@ -3876,7 +3876,7 @@
       </w:r>
       <w:r>
         <w:rPr>
-          <w:rFonts w:ascii="Times New Roman" w:cs="Times New Roman" w:eastAsia="Times New Roman" w:hAnsi="Times New Roman"/>
+          <w:rFonts w:ascii="Barlow Semi Condensed" w:cs="Barlow Semi Condensed" w:eastAsia="Barlow Semi Condensed" w:hAnsi="Barlow Semi Condensed"/>
           <w:i/>
           <w:iCs/>
           <w:sz w:val="24"/>
@@ -3886,7 +3886,7 @@
       </w:r>
       <w:r>
         <w:rPr>
-          <w:rFonts w:ascii="Times New Roman" w:cs="Times New Roman" w:eastAsia="Times New Roman" w:hAnsi="Times New Roman"/>
+          <w:rFonts w:ascii="Barlow Semi Condensed" w:cs="Barlow Semi Condensed" w:eastAsia="Barlow Semi Condensed" w:hAnsi="Barlow Semi Condensed"/>
           <w:sz w:val="24"/>
           <w:szCs w:val="24"/>
         </w:rPr>
@@ -3900,7 +3900,7 @@
       </w:pPr>
       <w:r>
         <w:rPr>
-          <w:rFonts w:ascii="Times New Roman" w:cs="Times New Roman" w:eastAsia="Times New Roman" w:hAnsi="Times New Roman"/>
+          <w:rFonts w:ascii="Barlow Semi Condensed" w:cs="Barlow Semi Condensed" w:eastAsia="Barlow Semi Condensed" w:hAnsi="Barlow Semi Condensed"/>
           <w:b/>
           <w:bCs/>
           <w:sz w:val="24"/>
@@ -3910,7 +3910,7 @@
       </w:r>
       <w:r>
         <w:rPr>
-          <w:rFonts w:ascii="Times New Roman" w:cs="Times New Roman" w:eastAsia="Times New Roman" w:hAnsi="Times New Roman"/>
+          <w:rFonts w:ascii="Barlow Semi Condensed" w:cs="Barlow Semi Condensed" w:eastAsia="Barlow Semi Condensed" w:hAnsi="Barlow Semi Condensed"/>
           <w:sz w:val="24"/>
           <w:szCs w:val="24"/>
         </w:rPr>
@@ -3932,7 +3932,7 @@
       </w:pPr>
       <w:r>
         <w:rPr>
-          <w:rFonts w:ascii="Times New Roman" w:cs="Times New Roman" w:eastAsia="Times New Roman" w:hAnsi="Times New Roman"/>
+          <w:rFonts w:ascii="Barlow Semi Condensed" w:cs="Barlow Semi Condensed" w:eastAsia="Barlow Semi Condensed" w:hAnsi="Barlow Semi Condensed"/>
           <w:i/>
           <w:iCs/>
           <w:sz w:val="24"/>
@@ -4129,7 +4129,7 @@
   <w:docDefaults>
     <w:rPrDefault>
       <w:rPr>
-        <w:rFonts w:ascii="Times New Roman" w:cs="Times New Roman" w:eastAsia="Times New Roman" w:hAnsi="Times New Roman"/>
+        <w:rFonts w:ascii="Barlow Semi Condensed" w:cs="Barlow Semi Condensed" w:eastAsia="Barlow Semi Condensed" w:hAnsi="Barlow Semi Condensed"/>
         <w:sz w:val="24"/>
         <w:szCs w:val="24"/>
       </w:rPr>
@@ -4316,7 +4316,7 @@
       <w:spacing w:after="120" w:before="240"/>
     </w:pPr>
     <w:rPr>
-      <w:rFonts w:ascii="Times New Roman" w:cs="Times New Roman" w:eastAsia="Times New Roman" w:hAnsi="Times New Roman"/>
+      <w:rFonts w:ascii="Barlow Semi Condensed" w:cs="Barlow Semi Condensed" w:eastAsia="Barlow Semi Condensed" w:hAnsi="Barlow Semi Condensed"/>
       <w:b/>
       <w:bCs/>
       <w:color w:val="1F3864"/>
@@ -4333,7 +4333,7 @@
       <w:spacing w:after="100" w:before="200"/>
     </w:pPr>
     <w:rPr>
-      <w:rFonts w:ascii="Times New Roman" w:cs="Times New Roman" w:eastAsia="Times New Roman" w:hAnsi="Times New Roman"/>
+      <w:rFonts w:ascii="Barlow Semi Condensed" w:cs="Barlow Semi Condensed" w:eastAsia="Barlow Semi Condensed" w:hAnsi="Barlow Semi Condensed"/>
       <w:b/>
       <w:bCs/>
       <w:color w:val="1F3864"/>
@@ -4350,7 +4350,7 @@
       <w:spacing w:after="80" w:before="160"/>
     </w:pPr>
     <w:rPr>
-      <w:rFonts w:ascii="Times New Roman" w:cs="Times New Roman" w:eastAsia="Times New Roman" w:hAnsi="Times New Roman"/>
+      <w:rFonts w:ascii="Barlow Semi Condensed" w:cs="Barlow Semi Condensed" w:eastAsia="Barlow Semi Condensed" w:hAnsi="Barlow Semi Condensed"/>
       <w:b/>
       <w:bCs/>
       <w:i/>

</xml_diff>